<commit_message>
opmaak inputvelden en labels van modals
</commit_message>
<xml_diff>
--- a/To-do's.docx
+++ b/To-do's.docx
@@ -23,12 +23,14 @@
           <w:lang w:val="en-US"/>
         </w:rPr>
       </w:pPr>
+      <w:proofErr w:type="spellStart"/>
       <w:r>
         <w:rPr>
           <w:lang w:val="en-US"/>
         </w:rPr>
         <w:t>Topbar</w:t>
       </w:r>
+      <w:proofErr w:type="spellEnd"/>
     </w:p>
     <w:p>
       <w:pPr>
@@ -86,12 +88,14 @@
           <w:lang w:val="en-US"/>
         </w:rPr>
       </w:pPr>
+      <w:proofErr w:type="spellStart"/>
       <w:r>
         <w:rPr>
           <w:lang w:val="en-US"/>
         </w:rPr>
         <w:t>Spelers</w:t>
       </w:r>
+      <w:proofErr w:type="spellEnd"/>
     </w:p>
     <w:p>
       <w:pPr>
@@ -171,7 +175,21 @@
         <w:rPr>
           <w:strike/>
         </w:rPr>
-        <w:t xml:space="preserve"> in dropdown.</w:t>
+        <w:t xml:space="preserve"> in </w:t>
+      </w:r>
+      <w:proofErr w:type="spellStart"/>
+      <w:r>
+        <w:rPr>
+          <w:strike/>
+        </w:rPr>
+        <w:t>dropdown</w:t>
+      </w:r>
+      <w:proofErr w:type="spellEnd"/>
+      <w:r>
+        <w:rPr>
+          <w:strike/>
+        </w:rPr>
+        <w:t>.</w:t>
       </w:r>
     </w:p>
     <w:p>
@@ -189,7 +207,21 @@
         <w:rPr>
           <w:strike/>
         </w:rPr>
-        <w:t>Radar chart toevoegen ter inspiratie.</w:t>
+        <w:t xml:space="preserve">Radar </w:t>
+      </w:r>
+      <w:proofErr w:type="spellStart"/>
+      <w:r>
+        <w:rPr>
+          <w:strike/>
+        </w:rPr>
+        <w:t>chart</w:t>
+      </w:r>
+      <w:proofErr w:type="spellEnd"/>
+      <w:r>
+        <w:rPr>
+          <w:strike/>
+        </w:rPr>
+        <w:t xml:space="preserve"> toevoegen ter inspiratie.</w:t>
       </w:r>
       <w:r>
         <w:rPr>
@@ -237,7 +269,21 @@
         <w:rPr>
           <w:strike/>
         </w:rPr>
-        <w:t>Radar chart niet wazig maar lichter van kleur</w:t>
+        <w:t xml:space="preserve">Radar </w:t>
+      </w:r>
+      <w:proofErr w:type="spellStart"/>
+      <w:r>
+        <w:rPr>
+          <w:strike/>
+        </w:rPr>
+        <w:t>chart</w:t>
+      </w:r>
+      <w:proofErr w:type="spellEnd"/>
+      <w:r>
+        <w:rPr>
+          <w:strike/>
+        </w:rPr>
+        <w:t xml:space="preserve"> niet wazig maar lichter van kleur</w:t>
       </w:r>
     </w:p>
     <w:p/>
@@ -280,8 +326,14 @@
           <w:ilvl w:val="0"/>
           <w:numId w:val="5"/>
         </w:numPr>
-      </w:pPr>
-      <w:r>
+        <w:rPr>
+          <w:strike/>
+        </w:rPr>
+      </w:pPr>
+      <w:r>
+        <w:rPr>
+          <w:strike/>
+        </w:rPr>
         <w:t xml:space="preserve">Geselecteerde veld is oranje omlijnd. </w:t>
       </w:r>
     </w:p>
@@ -310,8 +362,14 @@
           <w:ilvl w:val="0"/>
           <w:numId w:val="5"/>
         </w:numPr>
-      </w:pPr>
-      <w:r>
+        <w:rPr>
+          <w:strike/>
+        </w:rPr>
+      </w:pPr>
+      <w:r>
+        <w:rPr>
+          <w:strike/>
+        </w:rPr>
         <w:t>Hoofdletters van titel velden?</w:t>
       </w:r>
     </w:p>
@@ -340,8 +398,14 @@
           <w:ilvl w:val="0"/>
           <w:numId w:val="5"/>
         </w:numPr>
-      </w:pPr>
-      <w:r>
+        <w:rPr>
+          <w:strike/>
+        </w:rPr>
+      </w:pPr>
+      <w:r>
+        <w:rPr>
+          <w:strike/>
+        </w:rPr>
         <w:t>Notitieveld bij beide beschikbaar.</w:t>
       </w:r>
     </w:p>
@@ -352,11 +416,20 @@
           <w:ilvl w:val="0"/>
           <w:numId w:val="5"/>
         </w:numPr>
-      </w:pPr>
-      <w:r>
+        <w:rPr>
+          <w:strike/>
+        </w:rPr>
+      </w:pPr>
+      <w:r>
+        <w:rPr>
+          <w:strike/>
+        </w:rPr>
         <w:t>Tekstveld groter</w:t>
       </w:r>
       <w:r>
+        <w:rPr>
+          <w:strike/>
+        </w:rPr>
         <w:t xml:space="preserve"> en button onderaan</w:t>
       </w:r>
     </w:p>
@@ -451,7 +524,15 @@
         <w:t xml:space="preserve">Flow achter </w:t>
       </w:r>
       <w:r>
-        <w:t>gebruiker uitnodigen (e-mails versturen etc).</w:t>
+        <w:t xml:space="preserve">gebruiker uitnodigen (e-mails versturen </w:t>
+      </w:r>
+      <w:proofErr w:type="spellStart"/>
+      <w:r>
+        <w:t>etc</w:t>
+      </w:r>
+      <w:proofErr w:type="spellEnd"/>
+      <w:r>
+        <w:t>).</w:t>
       </w:r>
     </w:p>
     <w:p>
@@ -466,6 +547,7 @@
         <w:t>Import</w:t>
       </w:r>
     </w:p>
+    <w:p/>
     <w:p>
       <w:pPr>
         <w:pStyle w:val="Kop2"/>
@@ -548,7 +630,15 @@
         </w:numPr>
       </w:pPr>
       <w:r>
-        <w:t>Radar chart ook zichtbaar maken bij pop-up als je op naam speler gaat staan</w:t>
+        <w:t xml:space="preserve">Radar </w:t>
+      </w:r>
+      <w:proofErr w:type="spellStart"/>
+      <w:r>
+        <w:t>chart</w:t>
+      </w:r>
+      <w:proofErr w:type="spellEnd"/>
+      <w:r>
+        <w:t xml:space="preserve"> ook zichtbaar maken bij pop-up als je op naam speler gaat staan</w:t>
       </w:r>
     </w:p>
     <w:p>
@@ -560,7 +650,15 @@
         </w:numPr>
       </w:pPr>
       <w:r>
-        <w:t>Kleuren voor processtappen etc?</w:t>
+        <w:t xml:space="preserve">Kleuren voor processtappen </w:t>
+      </w:r>
+      <w:proofErr w:type="spellStart"/>
+      <w:r>
+        <w:t>etc</w:t>
+      </w:r>
+      <w:proofErr w:type="spellEnd"/>
+      <w:r>
+        <w:t>?</w:t>
       </w:r>
     </w:p>
     <w:p/>
@@ -580,9 +678,19 @@
           <w:numId w:val="12"/>
         </w:numPr>
       </w:pPr>
-      <w:r>
-        <w:t>Two-Factor authentication</w:t>
-      </w:r>
+      <w:proofErr w:type="spellStart"/>
+      <w:r>
+        <w:t>Two</w:t>
+      </w:r>
+      <w:proofErr w:type="spellEnd"/>
+      <w:r>
+        <w:t xml:space="preserve">-Factor </w:t>
+      </w:r>
+      <w:proofErr w:type="spellStart"/>
+      <w:r>
+        <w:t>authentication</w:t>
+      </w:r>
+      <w:proofErr w:type="spellEnd"/>
     </w:p>
     <w:p>
       <w:pPr>
@@ -593,7 +701,15 @@
         </w:numPr>
       </w:pPr>
       <w:r>
-        <w:t>Demo omgeving van football-scouting-platform zelf</w:t>
+        <w:t xml:space="preserve">Demo omgeving van </w:t>
+      </w:r>
+      <w:proofErr w:type="spellStart"/>
+      <w:r>
+        <w:t>football</w:t>
+      </w:r>
+      <w:proofErr w:type="spellEnd"/>
+      <w:r>
+        <w:t>-scouting-platform zelf</w:t>
       </w:r>
       <w:r>
         <w:t xml:space="preserve"> om potentiële gebruikers inzicht te geven in</w:t>
@@ -607,8 +723,13 @@
           <w:numId w:val="12"/>
         </w:numPr>
       </w:pPr>
-      <w:r>
-        <w:t xml:space="preserve">SuperAdmin user aanmaken die in alle afzonderlijke omgevingen </w:t>
+      <w:proofErr w:type="spellStart"/>
+      <w:r>
+        <w:t>SuperAdmin</w:t>
+      </w:r>
+      <w:proofErr w:type="spellEnd"/>
+      <w:r>
+        <w:t xml:space="preserve"> user aanmaken die in alle afzonderlijke omgevingen </w:t>
       </w:r>
       <w:r>
         <w:t xml:space="preserve">van de clubs </w:t>
@@ -627,12 +748,32 @@
         </w:numPr>
       </w:pPr>
       <w:r>
-        <w:lastRenderedPageBreak/>
         <w:t>Pi</w:t>
       </w:r>
       <w:r>
-        <w:t>pelines van dev naar acc naar prod</w:t>
-      </w:r>
+        <w:t xml:space="preserve">pelines van </w:t>
+      </w:r>
+      <w:proofErr w:type="spellStart"/>
+      <w:r>
+        <w:t>dev</w:t>
+      </w:r>
+      <w:proofErr w:type="spellEnd"/>
+      <w:r>
+        <w:t xml:space="preserve"> naar </w:t>
+      </w:r>
+      <w:proofErr w:type="spellStart"/>
+      <w:r>
+        <w:t>acc</w:t>
+      </w:r>
+      <w:proofErr w:type="spellEnd"/>
+      <w:r>
+        <w:t xml:space="preserve"> naar </w:t>
+      </w:r>
+      <w:proofErr w:type="spellStart"/>
+      <w:r>
+        <w:t>prod</w:t>
+      </w:r>
+      <w:proofErr w:type="spellEnd"/>
     </w:p>
     <w:p>
       <w:pPr>
@@ -654,8 +795,13 @@
           <w:numId w:val="14"/>
         </w:numPr>
       </w:pPr>
-      <w:r>
-        <w:t>Ghost component voor elke pagina</w:t>
+      <w:proofErr w:type="spellStart"/>
+      <w:r>
+        <w:t>Ghost</w:t>
+      </w:r>
+      <w:proofErr w:type="spellEnd"/>
+      <w:r>
+        <w:t xml:space="preserve"> component voor elke pagina</w:t>
       </w:r>
     </w:p>
     <w:sectPr>
@@ -3692,14 +3838,7 @@
 </file>
 
 <file path=customXml/item1.xml><?xml version="1.0" encoding="utf-8"?>
-<p:properties xmlns:p="http://schemas.microsoft.com/office/2006/metadata/properties" xmlns:xsi="http://www.w3.org/2001/XMLSchema-instance" xmlns:pc="http://schemas.microsoft.com/office/infopath/2007/PartnerControls">
-  <documentManagement>
-    <lcf76f155ced4ddcb4097134ff3c332f xmlns="08383384-0503-4771-b2ba-6fc3d51bf656">
-      <Terms xmlns="http://schemas.microsoft.com/office/infopath/2007/PartnerControls"/>
-    </lcf76f155ced4ddcb4097134ff3c332f>
-    <TaxCatchAll xmlns="c0acec82-785e-4a01-8b49-a31886450b92" xsi:nil="true"/>
-  </documentManagement>
-</p:properties>
+<b:Sources xmlns:b="http://schemas.openxmlformats.org/officeDocument/2006/bibliography" xmlns="http://schemas.openxmlformats.org/officeDocument/2006/bibliography" SelectedStyle="\APASixthEditionOfficeOnline.xsl" StyleName="APA" Version="6"/>
 </file>
 
 <file path=customXml/item2.xml><?xml version="1.0" encoding="utf-8"?>
@@ -3712,7 +3851,14 @@
 </file>
 
 <file path=customXml/item3.xml><?xml version="1.0" encoding="utf-8"?>
-<b:Sources xmlns:b="http://schemas.openxmlformats.org/officeDocument/2006/bibliography" xmlns="http://schemas.openxmlformats.org/officeDocument/2006/bibliography" SelectedStyle="\APASixthEditionOfficeOnline.xsl" StyleName="APA" Version="6"/>
+<p:properties xmlns:p="http://schemas.microsoft.com/office/2006/metadata/properties" xmlns:xsi="http://www.w3.org/2001/XMLSchema-instance" xmlns:pc="http://schemas.microsoft.com/office/infopath/2007/PartnerControls">
+  <documentManagement>
+    <lcf76f155ced4ddcb4097134ff3c332f xmlns="08383384-0503-4771-b2ba-6fc3d51bf656">
+      <Terms xmlns="http://schemas.microsoft.com/office/infopath/2007/PartnerControls"/>
+    </lcf76f155ced4ddcb4097134ff3c332f>
+    <TaxCatchAll xmlns="c0acec82-785e-4a01-8b49-a31886450b92" xsi:nil="true"/>
+  </documentManagement>
+</p:properties>
 </file>
 
 <file path=customXml/item4.xml><?xml version="1.0" encoding="utf-8"?>
@@ -3923,12 +4069,9 @@
 </file>
 
 <file path=customXml/itemProps1.xml><?xml version="1.0" encoding="utf-8"?>
-<ds:datastoreItem xmlns:ds="http://schemas.openxmlformats.org/officeDocument/2006/customXml" ds:itemID="{B4284606-6258-4C09-90D8-5C84A71D11A6}">
+<ds:datastoreItem xmlns:ds="http://schemas.openxmlformats.org/officeDocument/2006/customXml" ds:itemID="{C077093E-3BC1-48A6-8480-2DA9C69EAEE0}">
   <ds:schemaRefs>
-    <ds:schemaRef ds:uri="http://schemas.microsoft.com/office/2006/metadata/properties"/>
-    <ds:schemaRef ds:uri="http://schemas.microsoft.com/office/infopath/2007/PartnerControls"/>
-    <ds:schemaRef ds:uri="08383384-0503-4771-b2ba-6fc3d51bf656"/>
-    <ds:schemaRef ds:uri="c0acec82-785e-4a01-8b49-a31886450b92"/>
+    <ds:schemaRef ds:uri="http://schemas.openxmlformats.org/officeDocument/2006/bibliography"/>
   </ds:schemaRefs>
 </ds:datastoreItem>
 </file>
@@ -3942,9 +4085,12 @@
 </file>
 
 <file path=customXml/itemProps3.xml><?xml version="1.0" encoding="utf-8"?>
-<ds:datastoreItem xmlns:ds="http://schemas.openxmlformats.org/officeDocument/2006/customXml" ds:itemID="{C077093E-3BC1-48A6-8480-2DA9C69EAEE0}">
+<ds:datastoreItem xmlns:ds="http://schemas.openxmlformats.org/officeDocument/2006/customXml" ds:itemID="{B4284606-6258-4C09-90D8-5C84A71D11A6}">
   <ds:schemaRefs>
-    <ds:schemaRef ds:uri="http://schemas.openxmlformats.org/officeDocument/2006/bibliography"/>
+    <ds:schemaRef ds:uri="http://schemas.microsoft.com/office/2006/metadata/properties"/>
+    <ds:schemaRef ds:uri="http://schemas.microsoft.com/office/infopath/2007/PartnerControls"/>
+    <ds:schemaRef ds:uri="08383384-0503-4771-b2ba-6fc3d51bf656"/>
+    <ds:schemaRef ds:uri="c0acec82-785e-4a01-8b49-a31886450b92"/>
   </ds:schemaRefs>
 </ds:datastoreItem>
 </file>

</xml_diff>

<commit_message>
opmaak taken/contact en instellingen pagina
</commit_message>
<xml_diff>
--- a/To-do's.docx
+++ b/To-do's.docx
@@ -442,6 +442,9 @@
         <w:lastRenderedPageBreak/>
         <w:t>Nieuw contactmoment</w:t>
       </w:r>
+      <w:r>
+        <w:t>/taak</w:t>
+      </w:r>
     </w:p>
     <w:p>
       <w:pPr>
@@ -450,8 +453,14 @@
           <w:ilvl w:val="0"/>
           <w:numId w:val="7"/>
         </w:numPr>
-      </w:pPr>
-      <w:r>
+        <w:rPr>
+          <w:strike/>
+        </w:rPr>
+      </w:pPr>
+      <w:r>
+        <w:rPr>
+          <w:strike/>
+        </w:rPr>
         <w:t xml:space="preserve">Geselecteerde veld is oranje omlijnd. </w:t>
       </w:r>
     </w:p>
@@ -462,8 +471,14 @@
           <w:ilvl w:val="0"/>
           <w:numId w:val="7"/>
         </w:numPr>
-      </w:pPr>
-      <w:r>
+        <w:rPr>
+          <w:strike/>
+        </w:rPr>
+      </w:pPr>
+      <w:r>
+        <w:rPr>
+          <w:strike/>
+        </w:rPr>
         <w:t>Hoofdletters van titel velden?</w:t>
       </w:r>
     </w:p>
@@ -474,8 +489,14 @@
           <w:ilvl w:val="0"/>
           <w:numId w:val="7"/>
         </w:numPr>
-      </w:pPr>
-      <w:r>
+        <w:rPr>
+          <w:strike/>
+        </w:rPr>
+      </w:pPr>
+      <w:r>
+        <w:rPr>
+          <w:strike/>
+        </w:rPr>
         <w:t>Veld maken voor wie de speler heeft gesproken</w:t>
       </w:r>
     </w:p>

</xml_diff>

<commit_message>
acties voor gebruikers toegevoegd
</commit_message>
<xml_diff>
--- a/To-do's.docx
+++ b/To-do's.docx
@@ -516,8 +516,14 @@
           <w:ilvl w:val="0"/>
           <w:numId w:val="11"/>
         </w:numPr>
-      </w:pPr>
-      <w:r>
+        <w:rPr>
+          <w:strike/>
+        </w:rPr>
+      </w:pPr>
+      <w:r>
+        <w:rPr>
+          <w:strike/>
+        </w:rPr>
         <w:t>Header balk van tabel bij gebruikersbeheer is wit, hele tabel moet zelfde stijl hebben als tabel van spelers.</w:t>
       </w:r>
     </w:p>

</xml_diff>

<commit_message>
contactenpagina inclusief nieuwe taak, inputvelden onder elkaar
</commit_message>
<xml_diff>
--- a/To-do's.docx
+++ b/To-do's.docx
@@ -599,6 +599,48 @@
       </w:r>
       <w:r>
         <w:t xml:space="preserve"> van spelers mogelijk maken</w:t>
+      </w:r>
+    </w:p>
+    <w:p>
+      <w:pPr>
+        <w:pStyle w:val="Lijstalinea"/>
+        <w:numPr>
+          <w:ilvl w:val="1"/>
+          <w:numId w:val="11"/>
+        </w:numPr>
+        <w:rPr>
+          <w:strike/>
+        </w:rPr>
+      </w:pPr>
+      <w:r>
+        <w:rPr>
+          <w:strike/>
+        </w:rPr>
+        <w:t>Vormgeving</w:t>
+      </w:r>
+    </w:p>
+    <w:p>
+      <w:pPr>
+        <w:pStyle w:val="Lijstalinea"/>
+        <w:numPr>
+          <w:ilvl w:val="1"/>
+          <w:numId w:val="11"/>
+        </w:numPr>
+      </w:pPr>
+      <w:r>
+        <w:t>Functionaliteit</w:t>
+      </w:r>
+    </w:p>
+    <w:p>
+      <w:pPr>
+        <w:pStyle w:val="Lijstalinea"/>
+        <w:numPr>
+          <w:ilvl w:val="0"/>
+          <w:numId w:val="11"/>
+        </w:numPr>
+      </w:pPr>
+      <w:r>
+        <w:t>Instellen van welke interne teams zichtbaar zijn</w:t>
       </w:r>
     </w:p>
     <w:p/>
@@ -1138,6 +1180,7 @@
         <w:docPartUnique/>
       </w:docPartObj>
     </w:sdtPr>
+    <w:sdtEndPr/>
     <w:sdtContent>
       <w:p>
         <w:pPr>

</xml_diff>

<commit_message>
aanpassingen spelerspagina, intern/extern toggle en instellingen
</commit_message>
<xml_diff>
--- a/To-do's.docx
+++ b/To-do's.docx
@@ -99,35 +99,25 @@
     </w:p>
     <w:p>
       <w:pPr>
-        <w:rPr>
-          <w:lang w:val="en-US"/>
-        </w:rPr>
-      </w:pPr>
-    </w:p>
-    <w:p>
-      <w:pPr>
-        <w:pStyle w:val="Kop2"/>
-      </w:pPr>
-      <w:r>
-        <w:t>Spelersprofiel</w:t>
-      </w:r>
-    </w:p>
-    <w:p>
-      <w:pPr>
         <w:pStyle w:val="Lijstalinea"/>
         <w:numPr>
           <w:ilvl w:val="0"/>
-          <w:numId w:val="4"/>
+          <w:numId w:val="16"/>
         </w:numPr>
-        <w:rPr>
-          <w:strike/>
-        </w:rPr>
-      </w:pPr>
-      <w:r>
-        <w:rPr>
-          <w:strike/>
-        </w:rPr>
-        <w:t>Volgorde status, processtap en advies.</w:t>
+      </w:pPr>
+      <w:proofErr w:type="spellStart"/>
+      <w:r>
+        <w:t>Toggle</w:t>
+      </w:r>
+      <w:proofErr w:type="spellEnd"/>
+      <w:r>
+        <w:t xml:space="preserve"> extern/intern in het midd</w:t>
+      </w:r>
+      <w:r>
+        <w:t>en weergeven</w:t>
+      </w:r>
+      <w:r>
+        <w:t xml:space="preserve"> en iets meer vierkant maken zoals button</w:t>
       </w:r>
     </w:p>
     <w:p>
@@ -135,23 +125,11 @@
         <w:pStyle w:val="Lijstalinea"/>
         <w:numPr>
           <w:ilvl w:val="0"/>
-          <w:numId w:val="4"/>
+          <w:numId w:val="16"/>
         </w:numPr>
-        <w:rPr>
-          <w:strike/>
-        </w:rPr>
-      </w:pPr>
-      <w:r>
-        <w:rPr>
-          <w:strike/>
-        </w:rPr>
-        <w:t>H</w:t>
-      </w:r>
-      <w:r>
-        <w:rPr>
-          <w:strike/>
-        </w:rPr>
-        <w:t>andmatig bij status weg.</w:t>
+      </w:pPr>
+      <w:r>
+        <w:t>Speler toevoegen button ook bij view intern</w:t>
       </w:r>
     </w:p>
     <w:p>
@@ -159,37 +137,11 @@
         <w:pStyle w:val="Lijstalinea"/>
         <w:numPr>
           <w:ilvl w:val="0"/>
-          <w:numId w:val="4"/>
+          <w:numId w:val="16"/>
         </w:numPr>
-        <w:rPr>
-          <w:strike/>
-        </w:rPr>
-      </w:pPr>
-      <w:r>
-        <w:rPr>
-          <w:strike/>
-        </w:rPr>
-        <w:t>Advies opties toevoegen</w:t>
-      </w:r>
-      <w:r>
-        <w:rPr>
-          <w:strike/>
-        </w:rPr>
-        <w:t xml:space="preserve"> in </w:t>
-      </w:r>
-      <w:proofErr w:type="spellStart"/>
-      <w:r>
-        <w:rPr>
-          <w:strike/>
-        </w:rPr>
-        <w:t>dropdown</w:t>
-      </w:r>
-      <w:proofErr w:type="spellEnd"/>
-      <w:r>
-        <w:rPr>
-          <w:strike/>
-        </w:rPr>
-        <w:t>.</w:t>
+      </w:pPr>
+      <w:r>
+        <w:t>Selecteren seizoen bij interne selectie weg?</w:t>
       </w:r>
     </w:p>
     <w:p>
@@ -197,61 +149,14 @@
         <w:pStyle w:val="Lijstalinea"/>
         <w:numPr>
           <w:ilvl w:val="0"/>
-          <w:numId w:val="4"/>
+          <w:numId w:val="16"/>
         </w:numPr>
-        <w:rPr>
-          <w:strike/>
-        </w:rPr>
-      </w:pPr>
-      <w:r>
-        <w:rPr>
-          <w:strike/>
-        </w:rPr>
-        <w:t xml:space="preserve">Radar </w:t>
-      </w:r>
-      <w:proofErr w:type="spellStart"/>
-      <w:r>
-        <w:rPr>
-          <w:strike/>
-        </w:rPr>
-        <w:t>chart</w:t>
-      </w:r>
-      <w:proofErr w:type="spellEnd"/>
-      <w:r>
-        <w:rPr>
-          <w:strike/>
-        </w:rPr>
-        <w:t xml:space="preserve"> toevoegen ter inspiratie.</w:t>
-      </w:r>
-      <w:r>
-        <w:rPr>
-          <w:strike/>
-        </w:rPr>
-        <w:t xml:space="preserve"> Gebruik hierbij de 5 </w:t>
-      </w:r>
-      <w:r>
-        <w:rPr>
-          <w:strike/>
-        </w:rPr>
-        <w:t>categorieën</w:t>
-      </w:r>
-      <w:r>
-        <w:rPr>
-          <w:strike/>
-        </w:rPr>
-        <w:t xml:space="preserve"> met </w:t>
-      </w:r>
-      <w:r>
-        <w:rPr>
-          <w:strike/>
-        </w:rPr>
-        <w:t>techniek, visie, fysiek, mentaliteit</w:t>
-      </w:r>
-      <w:r>
-        <w:rPr>
-          <w:strike/>
-        </w:rPr>
-        <w:t xml:space="preserve"> en karakter. Werk met een schaal van 1-5 (die hoeft niet perse zichtbaar te zijn. </w:t>
+      </w:pPr>
+      <w:r>
+        <w:t>Wat doet zonder team</w:t>
+      </w:r>
+      <w:r>
+        <w:t xml:space="preserve"> knop?</w:t>
       </w:r>
     </w:p>
     <w:p>
@@ -259,31 +164,11 @@
         <w:pStyle w:val="Lijstalinea"/>
         <w:numPr>
           <w:ilvl w:val="0"/>
-          <w:numId w:val="4"/>
+          <w:numId w:val="16"/>
         </w:numPr>
-        <w:rPr>
-          <w:strike/>
-        </w:rPr>
-      </w:pPr>
-      <w:r>
-        <w:rPr>
-          <w:strike/>
-        </w:rPr>
-        <w:t xml:space="preserve">Radar </w:t>
-      </w:r>
-      <w:proofErr w:type="spellStart"/>
-      <w:r>
-        <w:rPr>
-          <w:strike/>
-        </w:rPr>
-        <w:t>chart</w:t>
-      </w:r>
-      <w:proofErr w:type="spellEnd"/>
-      <w:r>
-        <w:rPr>
-          <w:strike/>
-        </w:rPr>
-        <w:t xml:space="preserve"> niet wazig maar lichter van kleur</w:t>
+      </w:pPr>
+      <w:r>
+        <w:t>Opmaak tabel intern gelijkt trekken met opmaak extern</w:t>
       </w:r>
     </w:p>
     <w:p/>
@@ -292,13 +177,7 @@
         <w:pStyle w:val="Kop2"/>
       </w:pPr>
       <w:r>
-        <w:t>Bewerk</w:t>
-      </w:r>
-      <w:r>
-        <w:t>/nieuwe</w:t>
-      </w:r>
-      <w:r>
-        <w:t xml:space="preserve"> speler</w:t>
+        <w:t>Spelersprofiel</w:t>
       </w:r>
     </w:p>
     <w:p>
@@ -306,17 +185,23 @@
         <w:pStyle w:val="Lijstalinea"/>
         <w:numPr>
           <w:ilvl w:val="0"/>
-          <w:numId w:val="5"/>
+          <w:numId w:val="17"/>
         </w:numPr>
-        <w:rPr>
-          <w:strike/>
-        </w:rPr>
-      </w:pPr>
-      <w:r>
-        <w:rPr>
-          <w:strike/>
-        </w:rPr>
-        <w:t>Opslaan sluit ook het venster</w:t>
+      </w:pPr>
+    </w:p>
+    <w:p/>
+    <w:p>
+      <w:pPr>
+        <w:pStyle w:val="Kop2"/>
+      </w:pPr>
+      <w:r>
+        <w:t>Bewerk</w:t>
+      </w:r>
+      <w:r>
+        <w:t>/nieuwe</w:t>
+      </w:r>
+      <w:r>
+        <w:t xml:space="preserve"> speler</w:t>
       </w:r>
     </w:p>
     <w:p>
@@ -324,114 +209,9 @@
         <w:pStyle w:val="Lijstalinea"/>
         <w:numPr>
           <w:ilvl w:val="0"/>
-          <w:numId w:val="5"/>
+          <w:numId w:val="19"/>
         </w:numPr>
-        <w:rPr>
-          <w:strike/>
-        </w:rPr>
-      </w:pPr>
-      <w:r>
-        <w:rPr>
-          <w:strike/>
-        </w:rPr>
-        <w:t xml:space="preserve">Geselecteerde veld is oranje omlijnd. </w:t>
-      </w:r>
-    </w:p>
-    <w:p>
-      <w:pPr>
-        <w:pStyle w:val="Lijstalinea"/>
-        <w:numPr>
-          <w:ilvl w:val="0"/>
-          <w:numId w:val="5"/>
-        </w:numPr>
-        <w:rPr>
-          <w:strike/>
-        </w:rPr>
-      </w:pPr>
-      <w:r>
-        <w:rPr>
-          <w:strike/>
-        </w:rPr>
-        <w:t>Geboortedatum en leeftijd veld als geboortedatum onbekend is?</w:t>
-      </w:r>
-    </w:p>
-    <w:p>
-      <w:pPr>
-        <w:pStyle w:val="Lijstalinea"/>
-        <w:numPr>
-          <w:ilvl w:val="0"/>
-          <w:numId w:val="5"/>
-        </w:numPr>
-        <w:rPr>
-          <w:strike/>
-        </w:rPr>
-      </w:pPr>
-      <w:r>
-        <w:rPr>
-          <w:strike/>
-        </w:rPr>
-        <w:t>Hoofdletters van titel velden?</w:t>
-      </w:r>
-    </w:p>
-    <w:p>
-      <w:pPr>
-        <w:pStyle w:val="Lijstalinea"/>
-        <w:numPr>
-          <w:ilvl w:val="0"/>
-          <w:numId w:val="5"/>
-        </w:numPr>
-        <w:rPr>
-          <w:strike/>
-        </w:rPr>
-      </w:pPr>
-      <w:r>
-        <w:rPr>
-          <w:strike/>
-        </w:rPr>
-        <w:t>Volgorde van kolommen wijzigen</w:t>
-      </w:r>
-    </w:p>
-    <w:p>
-      <w:pPr>
-        <w:pStyle w:val="Lijstalinea"/>
-        <w:numPr>
-          <w:ilvl w:val="0"/>
-          <w:numId w:val="5"/>
-        </w:numPr>
-        <w:rPr>
-          <w:strike/>
-        </w:rPr>
-      </w:pPr>
-      <w:r>
-        <w:rPr>
-          <w:strike/>
-        </w:rPr>
-        <w:t>Notitieveld bij beide beschikbaar.</w:t>
-      </w:r>
-    </w:p>
-    <w:p>
-      <w:pPr>
-        <w:pStyle w:val="Lijstalinea"/>
-        <w:numPr>
-          <w:ilvl w:val="0"/>
-          <w:numId w:val="5"/>
-        </w:numPr>
-        <w:rPr>
-          <w:strike/>
-        </w:rPr>
-      </w:pPr>
-      <w:r>
-        <w:rPr>
-          <w:strike/>
-        </w:rPr>
-        <w:t>Tekstveld groter</w:t>
-      </w:r>
-      <w:r>
-        <w:rPr>
-          <w:strike/>
-        </w:rPr>
-        <w:t xml:space="preserve"> en button onderaan</w:t>
-      </w:r>
+      </w:pPr>
     </w:p>
     <w:p/>
     <w:p>
@@ -439,7 +219,6 @@
         <w:pStyle w:val="Kop2"/>
       </w:pPr>
       <w:r>
-        <w:lastRenderedPageBreak/>
         <w:t>Nieuw contactmoment</w:t>
       </w:r>
       <w:r>
@@ -521,6 +300,7 @@
         </w:numPr>
       </w:pPr>
       <w:r>
+        <w:lastRenderedPageBreak/>
         <w:t>Contact aanmaken vanuit contacten pagina</w:t>
       </w:r>
     </w:p>
@@ -720,7 +500,6 @@
         <w:pStyle w:val="Kop1"/>
       </w:pPr>
       <w:r>
-        <w:lastRenderedPageBreak/>
         <w:t>Post MVP</w:t>
       </w:r>
     </w:p>
@@ -765,6 +544,7 @@
         </w:numPr>
       </w:pPr>
       <w:r>
+        <w:lastRenderedPageBreak/>
         <w:t xml:space="preserve">Radar </w:t>
       </w:r>
       <w:proofErr w:type="spellStart"/>
@@ -1062,15 +842,49 @@
         </w:numPr>
       </w:pPr>
       <w:r>
-        <w:t xml:space="preserve">7 t/m 9 mei weg --&gt; </w:t>
-      </w:r>
-      <w:r>
-        <w:t>8 t/m 9 doen</w:t>
-      </w:r>
-      <w:r>
+        <w:rPr>
+          <w:lang w:val="de-DE"/>
+        </w:rPr>
+        <w:t xml:space="preserve">7 t/m 9 </w:t>
+      </w:r>
+      <w:proofErr w:type="spellStart"/>
+      <w:r>
+        <w:rPr>
+          <w:lang w:val="de-DE"/>
+        </w:rPr>
+        <w:t>mei</w:t>
+      </w:r>
+      <w:proofErr w:type="spellEnd"/>
+      <w:r>
+        <w:rPr>
+          <w:lang w:val="de-DE"/>
+        </w:rPr>
+        <w:t xml:space="preserve"> weg --&gt; </w:t>
+      </w:r>
+      <w:r>
+        <w:rPr>
+          <w:lang w:val="de-DE"/>
+        </w:rPr>
+        <w:t xml:space="preserve">8 t/m 9 </w:t>
+      </w:r>
+      <w:proofErr w:type="spellStart"/>
+      <w:r>
+        <w:rPr>
+          <w:lang w:val="de-DE"/>
+        </w:rPr>
+        <w:t>doen</w:t>
+      </w:r>
+      <w:proofErr w:type="spellEnd"/>
+      <w:r>
+        <w:rPr>
+          <w:lang w:val="de-DE"/>
+        </w:rPr>
         <w:t>?</w:t>
       </w:r>
       <w:r>
+        <w:rPr>
+          <w:lang w:val="de-DE"/>
+        </w:rPr>
         <w:t xml:space="preserve"> </w:t>
       </w:r>
       <w:r>
@@ -1106,10 +920,7 @@
         <w:t xml:space="preserve">mogelijk spelen we dan nog nacompetitie </w:t>
       </w:r>
       <w:r>
-        <w:t xml:space="preserve">en ben dan net terug van Ierland, </w:t>
-      </w:r>
-      <w:r>
-        <w:t>vrijdag 10 april doen?</w:t>
+        <w:t>en ben dan net terug van Ierland, vrijdag 10 april doen?</w:t>
       </w:r>
     </w:p>
     <w:p>
@@ -1180,7 +991,6 @@
         <w:docPartUnique/>
       </w:docPartObj>
     </w:sdtPr>
-    <w:sdtEndPr/>
     <w:sdtContent>
       <w:p>
         <w:pPr>
@@ -1358,7 +1168,7 @@
         <v:path o:extrusionok="f" gradientshapeok="t" o:connecttype="rect"/>
         <o:lock v:ext="edit" aspectratio="t"/>
       </v:shapetype>
-      <v:shape id="_x0000_i1025" type="#_x0000_t75" style="width:138.5pt;height:85.5pt" o:bullet="t">
+      <v:shape id="_x0000_i1025" type="#_x0000_t75" style="width:138.75pt;height:85.5pt" o:bullet="t">
         <v:imagedata r:id="rId1" o:title="Bloei symbool horizontaal"/>
       </v:shape>
     </w:pict>
@@ -2174,6 +1984,92 @@
     </w:lvl>
   </w:abstractNum>
   <w:abstractNum w:abstractNumId="8" w15:restartNumberingAfterBreak="0">
+    <w:nsid w:val="33601CB7"/>
+    <w:multiLevelType w:val="hybridMultilevel"/>
+    <w:tmpl w:val="A9F21C24"/>
+    <w:lvl w:ilvl="0" w:tplc="0413000F">
+      <w:start w:val="1"/>
+      <w:numFmt w:val="decimal"/>
+      <w:lvlText w:val="%1."/>
+      <w:lvlJc w:val="left"/>
+      <w:pPr>
+        <w:ind w:left="720" w:hanging="360"/>
+      </w:pPr>
+    </w:lvl>
+    <w:lvl w:ilvl="1" w:tplc="04130019" w:tentative="1">
+      <w:start w:val="1"/>
+      <w:numFmt w:val="lowerLetter"/>
+      <w:lvlText w:val="%2."/>
+      <w:lvlJc w:val="left"/>
+      <w:pPr>
+        <w:ind w:left="1440" w:hanging="360"/>
+      </w:pPr>
+    </w:lvl>
+    <w:lvl w:ilvl="2" w:tplc="0413001B" w:tentative="1">
+      <w:start w:val="1"/>
+      <w:numFmt w:val="lowerRoman"/>
+      <w:lvlText w:val="%3."/>
+      <w:lvlJc w:val="right"/>
+      <w:pPr>
+        <w:ind w:left="2160" w:hanging="180"/>
+      </w:pPr>
+    </w:lvl>
+    <w:lvl w:ilvl="3" w:tplc="0413000F" w:tentative="1">
+      <w:start w:val="1"/>
+      <w:numFmt w:val="decimal"/>
+      <w:lvlText w:val="%4."/>
+      <w:lvlJc w:val="left"/>
+      <w:pPr>
+        <w:ind w:left="2880" w:hanging="360"/>
+      </w:pPr>
+    </w:lvl>
+    <w:lvl w:ilvl="4" w:tplc="04130019" w:tentative="1">
+      <w:start w:val="1"/>
+      <w:numFmt w:val="lowerLetter"/>
+      <w:lvlText w:val="%5."/>
+      <w:lvlJc w:val="left"/>
+      <w:pPr>
+        <w:ind w:left="3600" w:hanging="360"/>
+      </w:pPr>
+    </w:lvl>
+    <w:lvl w:ilvl="5" w:tplc="0413001B" w:tentative="1">
+      <w:start w:val="1"/>
+      <w:numFmt w:val="lowerRoman"/>
+      <w:lvlText w:val="%6."/>
+      <w:lvlJc w:val="right"/>
+      <w:pPr>
+        <w:ind w:left="4320" w:hanging="180"/>
+      </w:pPr>
+    </w:lvl>
+    <w:lvl w:ilvl="6" w:tplc="0413000F" w:tentative="1">
+      <w:start w:val="1"/>
+      <w:numFmt w:val="decimal"/>
+      <w:lvlText w:val="%7."/>
+      <w:lvlJc w:val="left"/>
+      <w:pPr>
+        <w:ind w:left="5040" w:hanging="360"/>
+      </w:pPr>
+    </w:lvl>
+    <w:lvl w:ilvl="7" w:tplc="04130019" w:tentative="1">
+      <w:start w:val="1"/>
+      <w:numFmt w:val="lowerLetter"/>
+      <w:lvlText w:val="%8."/>
+      <w:lvlJc w:val="left"/>
+      <w:pPr>
+        <w:ind w:left="5760" w:hanging="360"/>
+      </w:pPr>
+    </w:lvl>
+    <w:lvl w:ilvl="8" w:tplc="0413001B" w:tentative="1">
+      <w:start w:val="1"/>
+      <w:numFmt w:val="lowerRoman"/>
+      <w:lvlText w:val="%9."/>
+      <w:lvlJc w:val="right"/>
+      <w:pPr>
+        <w:ind w:left="6480" w:hanging="180"/>
+      </w:pPr>
+    </w:lvl>
+  </w:abstractNum>
+  <w:abstractNum w:abstractNumId="9" w15:restartNumberingAfterBreak="0">
     <w:nsid w:val="37642C8F"/>
     <w:multiLevelType w:val="hybridMultilevel"/>
     <w:tmpl w:val="6B82B0D4"/>
@@ -2259,7 +2155,93 @@
       </w:pPr>
     </w:lvl>
   </w:abstractNum>
-  <w:abstractNum w:abstractNumId="9" w15:restartNumberingAfterBreak="0">
+  <w:abstractNum w:abstractNumId="10" w15:restartNumberingAfterBreak="0">
+    <w:nsid w:val="3FF556F9"/>
+    <w:multiLevelType w:val="hybridMultilevel"/>
+    <w:tmpl w:val="A008DA8C"/>
+    <w:lvl w:ilvl="0" w:tplc="FFFFFFFF">
+      <w:start w:val="1"/>
+      <w:numFmt w:val="decimal"/>
+      <w:lvlText w:val="%1."/>
+      <w:lvlJc w:val="left"/>
+      <w:pPr>
+        <w:ind w:left="720" w:hanging="360"/>
+      </w:pPr>
+    </w:lvl>
+    <w:lvl w:ilvl="1" w:tplc="04130019" w:tentative="1">
+      <w:start w:val="1"/>
+      <w:numFmt w:val="lowerLetter"/>
+      <w:lvlText w:val="%2."/>
+      <w:lvlJc w:val="left"/>
+      <w:pPr>
+        <w:ind w:left="1440" w:hanging="360"/>
+      </w:pPr>
+    </w:lvl>
+    <w:lvl w:ilvl="2" w:tplc="0413001B" w:tentative="1">
+      <w:start w:val="1"/>
+      <w:numFmt w:val="lowerRoman"/>
+      <w:lvlText w:val="%3."/>
+      <w:lvlJc w:val="right"/>
+      <w:pPr>
+        <w:ind w:left="2160" w:hanging="180"/>
+      </w:pPr>
+    </w:lvl>
+    <w:lvl w:ilvl="3" w:tplc="0413000F" w:tentative="1">
+      <w:start w:val="1"/>
+      <w:numFmt w:val="decimal"/>
+      <w:lvlText w:val="%4."/>
+      <w:lvlJc w:val="left"/>
+      <w:pPr>
+        <w:ind w:left="2880" w:hanging="360"/>
+      </w:pPr>
+    </w:lvl>
+    <w:lvl w:ilvl="4" w:tplc="04130019" w:tentative="1">
+      <w:start w:val="1"/>
+      <w:numFmt w:val="lowerLetter"/>
+      <w:lvlText w:val="%5."/>
+      <w:lvlJc w:val="left"/>
+      <w:pPr>
+        <w:ind w:left="3600" w:hanging="360"/>
+      </w:pPr>
+    </w:lvl>
+    <w:lvl w:ilvl="5" w:tplc="0413001B" w:tentative="1">
+      <w:start w:val="1"/>
+      <w:numFmt w:val="lowerRoman"/>
+      <w:lvlText w:val="%6."/>
+      <w:lvlJc w:val="right"/>
+      <w:pPr>
+        <w:ind w:left="4320" w:hanging="180"/>
+      </w:pPr>
+    </w:lvl>
+    <w:lvl w:ilvl="6" w:tplc="0413000F" w:tentative="1">
+      <w:start w:val="1"/>
+      <w:numFmt w:val="decimal"/>
+      <w:lvlText w:val="%7."/>
+      <w:lvlJc w:val="left"/>
+      <w:pPr>
+        <w:ind w:left="5040" w:hanging="360"/>
+      </w:pPr>
+    </w:lvl>
+    <w:lvl w:ilvl="7" w:tplc="04130019" w:tentative="1">
+      <w:start w:val="1"/>
+      <w:numFmt w:val="lowerLetter"/>
+      <w:lvlText w:val="%8."/>
+      <w:lvlJc w:val="left"/>
+      <w:pPr>
+        <w:ind w:left="5760" w:hanging="360"/>
+      </w:pPr>
+    </w:lvl>
+    <w:lvl w:ilvl="8" w:tplc="0413001B" w:tentative="1">
+      <w:start w:val="1"/>
+      <w:numFmt w:val="lowerRoman"/>
+      <w:lvlText w:val="%9."/>
+      <w:lvlJc w:val="right"/>
+      <w:pPr>
+        <w:ind w:left="6480" w:hanging="180"/>
+      </w:pPr>
+    </w:lvl>
+  </w:abstractNum>
+  <w:abstractNum w:abstractNumId="11" w15:restartNumberingAfterBreak="0">
     <w:nsid w:val="403275E7"/>
     <w:multiLevelType w:val="hybridMultilevel"/>
     <w:tmpl w:val="D5E8A2A0"/>
@@ -2348,7 +2330,93 @@
       </w:pPr>
     </w:lvl>
   </w:abstractNum>
-  <w:abstractNum w:abstractNumId="10" w15:restartNumberingAfterBreak="0">
+  <w:abstractNum w:abstractNumId="12" w15:restartNumberingAfterBreak="0">
+    <w:nsid w:val="52804473"/>
+    <w:multiLevelType w:val="hybridMultilevel"/>
+    <w:tmpl w:val="FAECCAFE"/>
+    <w:lvl w:ilvl="0" w:tplc="0413000F">
+      <w:start w:val="1"/>
+      <w:numFmt w:val="decimal"/>
+      <w:lvlText w:val="%1."/>
+      <w:lvlJc w:val="left"/>
+      <w:pPr>
+        <w:ind w:left="720" w:hanging="360"/>
+      </w:pPr>
+    </w:lvl>
+    <w:lvl w:ilvl="1" w:tplc="04130019" w:tentative="1">
+      <w:start w:val="1"/>
+      <w:numFmt w:val="lowerLetter"/>
+      <w:lvlText w:val="%2."/>
+      <w:lvlJc w:val="left"/>
+      <w:pPr>
+        <w:ind w:left="1440" w:hanging="360"/>
+      </w:pPr>
+    </w:lvl>
+    <w:lvl w:ilvl="2" w:tplc="0413001B" w:tentative="1">
+      <w:start w:val="1"/>
+      <w:numFmt w:val="lowerRoman"/>
+      <w:lvlText w:val="%3."/>
+      <w:lvlJc w:val="right"/>
+      <w:pPr>
+        <w:ind w:left="2160" w:hanging="180"/>
+      </w:pPr>
+    </w:lvl>
+    <w:lvl w:ilvl="3" w:tplc="0413000F" w:tentative="1">
+      <w:start w:val="1"/>
+      <w:numFmt w:val="decimal"/>
+      <w:lvlText w:val="%4."/>
+      <w:lvlJc w:val="left"/>
+      <w:pPr>
+        <w:ind w:left="2880" w:hanging="360"/>
+      </w:pPr>
+    </w:lvl>
+    <w:lvl w:ilvl="4" w:tplc="04130019" w:tentative="1">
+      <w:start w:val="1"/>
+      <w:numFmt w:val="lowerLetter"/>
+      <w:lvlText w:val="%5."/>
+      <w:lvlJc w:val="left"/>
+      <w:pPr>
+        <w:ind w:left="3600" w:hanging="360"/>
+      </w:pPr>
+    </w:lvl>
+    <w:lvl w:ilvl="5" w:tplc="0413001B" w:tentative="1">
+      <w:start w:val="1"/>
+      <w:numFmt w:val="lowerRoman"/>
+      <w:lvlText w:val="%6."/>
+      <w:lvlJc w:val="right"/>
+      <w:pPr>
+        <w:ind w:left="4320" w:hanging="180"/>
+      </w:pPr>
+    </w:lvl>
+    <w:lvl w:ilvl="6" w:tplc="0413000F" w:tentative="1">
+      <w:start w:val="1"/>
+      <w:numFmt w:val="decimal"/>
+      <w:lvlText w:val="%7."/>
+      <w:lvlJc w:val="left"/>
+      <w:pPr>
+        <w:ind w:left="5040" w:hanging="360"/>
+      </w:pPr>
+    </w:lvl>
+    <w:lvl w:ilvl="7" w:tplc="04130019" w:tentative="1">
+      <w:start w:val="1"/>
+      <w:numFmt w:val="lowerLetter"/>
+      <w:lvlText w:val="%8."/>
+      <w:lvlJc w:val="left"/>
+      <w:pPr>
+        <w:ind w:left="5760" w:hanging="360"/>
+      </w:pPr>
+    </w:lvl>
+    <w:lvl w:ilvl="8" w:tplc="0413001B" w:tentative="1">
+      <w:start w:val="1"/>
+      <w:numFmt w:val="lowerRoman"/>
+      <w:lvlText w:val="%9."/>
+      <w:lvlJc w:val="right"/>
+      <w:pPr>
+        <w:ind w:left="6480" w:hanging="180"/>
+      </w:pPr>
+    </w:lvl>
+  </w:abstractNum>
+  <w:abstractNum w:abstractNumId="13" w15:restartNumberingAfterBreak="0">
     <w:nsid w:val="54DB2E25"/>
     <w:multiLevelType w:val="hybridMultilevel"/>
     <w:tmpl w:val="CC9C1A6A"/>
@@ -2437,7 +2505,93 @@
       </w:pPr>
     </w:lvl>
   </w:abstractNum>
-  <w:abstractNum w:abstractNumId="11" w15:restartNumberingAfterBreak="0">
+  <w:abstractNum w:abstractNumId="14" w15:restartNumberingAfterBreak="0">
+    <w:nsid w:val="55F31195"/>
+    <w:multiLevelType w:val="hybridMultilevel"/>
+    <w:tmpl w:val="FAECCAFE"/>
+    <w:lvl w:ilvl="0" w:tplc="FFFFFFFF">
+      <w:start w:val="1"/>
+      <w:numFmt w:val="decimal"/>
+      <w:lvlText w:val="%1."/>
+      <w:lvlJc w:val="left"/>
+      <w:pPr>
+        <w:ind w:left="720" w:hanging="360"/>
+      </w:pPr>
+    </w:lvl>
+    <w:lvl w:ilvl="1" w:tplc="FFFFFFFF" w:tentative="1">
+      <w:start w:val="1"/>
+      <w:numFmt w:val="lowerLetter"/>
+      <w:lvlText w:val="%2."/>
+      <w:lvlJc w:val="left"/>
+      <w:pPr>
+        <w:ind w:left="1440" w:hanging="360"/>
+      </w:pPr>
+    </w:lvl>
+    <w:lvl w:ilvl="2" w:tplc="FFFFFFFF" w:tentative="1">
+      <w:start w:val="1"/>
+      <w:numFmt w:val="lowerRoman"/>
+      <w:lvlText w:val="%3."/>
+      <w:lvlJc w:val="right"/>
+      <w:pPr>
+        <w:ind w:left="2160" w:hanging="180"/>
+      </w:pPr>
+    </w:lvl>
+    <w:lvl w:ilvl="3" w:tplc="FFFFFFFF" w:tentative="1">
+      <w:start w:val="1"/>
+      <w:numFmt w:val="decimal"/>
+      <w:lvlText w:val="%4."/>
+      <w:lvlJc w:val="left"/>
+      <w:pPr>
+        <w:ind w:left="2880" w:hanging="360"/>
+      </w:pPr>
+    </w:lvl>
+    <w:lvl w:ilvl="4" w:tplc="FFFFFFFF" w:tentative="1">
+      <w:start w:val="1"/>
+      <w:numFmt w:val="lowerLetter"/>
+      <w:lvlText w:val="%5."/>
+      <w:lvlJc w:val="left"/>
+      <w:pPr>
+        <w:ind w:left="3600" w:hanging="360"/>
+      </w:pPr>
+    </w:lvl>
+    <w:lvl w:ilvl="5" w:tplc="FFFFFFFF" w:tentative="1">
+      <w:start w:val="1"/>
+      <w:numFmt w:val="lowerRoman"/>
+      <w:lvlText w:val="%6."/>
+      <w:lvlJc w:val="right"/>
+      <w:pPr>
+        <w:ind w:left="4320" w:hanging="180"/>
+      </w:pPr>
+    </w:lvl>
+    <w:lvl w:ilvl="6" w:tplc="FFFFFFFF" w:tentative="1">
+      <w:start w:val="1"/>
+      <w:numFmt w:val="decimal"/>
+      <w:lvlText w:val="%7."/>
+      <w:lvlJc w:val="left"/>
+      <w:pPr>
+        <w:ind w:left="5040" w:hanging="360"/>
+      </w:pPr>
+    </w:lvl>
+    <w:lvl w:ilvl="7" w:tplc="FFFFFFFF" w:tentative="1">
+      <w:start w:val="1"/>
+      <w:numFmt w:val="lowerLetter"/>
+      <w:lvlText w:val="%8."/>
+      <w:lvlJc w:val="left"/>
+      <w:pPr>
+        <w:ind w:left="5760" w:hanging="360"/>
+      </w:pPr>
+    </w:lvl>
+    <w:lvl w:ilvl="8" w:tplc="FFFFFFFF" w:tentative="1">
+      <w:start w:val="1"/>
+      <w:numFmt w:val="lowerRoman"/>
+      <w:lvlText w:val="%9."/>
+      <w:lvlJc w:val="right"/>
+      <w:pPr>
+        <w:ind w:left="6480" w:hanging="180"/>
+      </w:pPr>
+    </w:lvl>
+  </w:abstractNum>
+  <w:abstractNum w:abstractNumId="15" w15:restartNumberingAfterBreak="0">
     <w:nsid w:val="5C6E4174"/>
     <w:multiLevelType w:val="hybridMultilevel"/>
     <w:tmpl w:val="CDDE5098"/>
@@ -2526,7 +2680,7 @@
       </w:pPr>
     </w:lvl>
   </w:abstractNum>
-  <w:abstractNum w:abstractNumId="12" w15:restartNumberingAfterBreak="0">
+  <w:abstractNum w:abstractNumId="16" w15:restartNumberingAfterBreak="0">
     <w:nsid w:val="67A445E7"/>
     <w:multiLevelType w:val="hybridMultilevel"/>
     <w:tmpl w:val="D5E8A2A0"/>
@@ -2615,7 +2769,7 @@
       </w:pPr>
     </w:lvl>
   </w:abstractNum>
-  <w:abstractNum w:abstractNumId="13" w15:restartNumberingAfterBreak="0">
+  <w:abstractNum w:abstractNumId="17" w15:restartNumberingAfterBreak="0">
     <w:nsid w:val="77EA28BC"/>
     <w:multiLevelType w:val="hybridMultilevel"/>
     <w:tmpl w:val="81786030"/>
@@ -2704,7 +2858,7 @@
       </w:pPr>
     </w:lvl>
   </w:abstractNum>
-  <w:abstractNum w:abstractNumId="14" w15:restartNumberingAfterBreak="0">
+  <w:abstractNum w:abstractNumId="18" w15:restartNumberingAfterBreak="0">
     <w:nsid w:val="7FC27E1C"/>
     <w:multiLevelType w:val="hybridMultilevel"/>
     <w:tmpl w:val="A4EC61AC"/>
@@ -2830,28 +2984,28 @@
     <w:abstractNumId w:val="5"/>
   </w:num>
   <w:num w:numId="5" w16cid:durableId="934829291">
-    <w:abstractNumId w:val="9"/>
+    <w:abstractNumId w:val="11"/>
   </w:num>
   <w:num w:numId="6" w16cid:durableId="382411352">
-    <w:abstractNumId w:val="13"/>
+    <w:abstractNumId w:val="17"/>
   </w:num>
   <w:num w:numId="7" w16cid:durableId="1667125263">
-    <w:abstractNumId w:val="12"/>
+    <w:abstractNumId w:val="16"/>
   </w:num>
   <w:num w:numId="8" w16cid:durableId="1585648028">
     <w:abstractNumId w:val="6"/>
   </w:num>
   <w:num w:numId="9" w16cid:durableId="33774363">
-    <w:abstractNumId w:val="10"/>
+    <w:abstractNumId w:val="13"/>
   </w:num>
   <w:num w:numId="10" w16cid:durableId="1018388865">
     <w:abstractNumId w:val="2"/>
   </w:num>
   <w:num w:numId="11" w16cid:durableId="1752121715">
-    <w:abstractNumId w:val="11"/>
+    <w:abstractNumId w:val="15"/>
   </w:num>
   <w:num w:numId="12" w16cid:durableId="1825123615">
-    <w:abstractNumId w:val="8"/>
+    <w:abstractNumId w:val="9"/>
   </w:num>
   <w:num w:numId="13" w16cid:durableId="1152143081">
     <w:abstractNumId w:val="1"/>
@@ -2860,7 +3014,19 @@
     <w:abstractNumId w:val="0"/>
   </w:num>
   <w:num w:numId="15" w16cid:durableId="825436499">
+    <w:abstractNumId w:val="18"/>
+  </w:num>
+  <w:num w:numId="16" w16cid:durableId="906039698">
+    <w:abstractNumId w:val="8"/>
+  </w:num>
+  <w:num w:numId="17" w16cid:durableId="1196235328">
+    <w:abstractNumId w:val="12"/>
+  </w:num>
+  <w:num w:numId="18" w16cid:durableId="732700911">
     <w:abstractNumId w:val="14"/>
+  </w:num>
+  <w:num w:numId="19" w16cid:durableId="1526284346">
+    <w:abstractNumId w:val="10"/>
   </w:num>
 </w:numbering>
 </file>
@@ -4281,7 +4447,14 @@
 </file>
 
 <file path=customXml/item1.xml><?xml version="1.0" encoding="utf-8"?>
-<b:Sources xmlns:b="http://schemas.openxmlformats.org/officeDocument/2006/bibliography" xmlns="http://schemas.openxmlformats.org/officeDocument/2006/bibliography" SelectedStyle="\APASixthEditionOfficeOnline.xsl" StyleName="APA" Version="6"/>
+<p:properties xmlns:p="http://schemas.microsoft.com/office/2006/metadata/properties" xmlns:xsi="http://www.w3.org/2001/XMLSchema-instance" xmlns:pc="http://schemas.microsoft.com/office/infopath/2007/PartnerControls">
+  <documentManagement>
+    <lcf76f155ced4ddcb4097134ff3c332f xmlns="08383384-0503-4771-b2ba-6fc3d51bf656">
+      <Terms xmlns="http://schemas.microsoft.com/office/infopath/2007/PartnerControls"/>
+    </lcf76f155ced4ddcb4097134ff3c332f>
+    <TaxCatchAll xmlns="c0acec82-785e-4a01-8b49-a31886450b92" xsi:nil="true"/>
+  </documentManagement>
+</p:properties>
 </file>
 
 <file path=customXml/item2.xml><?xml version="1.0" encoding="utf-8"?>
@@ -4294,14 +4467,7 @@
 </file>
 
 <file path=customXml/item3.xml><?xml version="1.0" encoding="utf-8"?>
-<p:properties xmlns:p="http://schemas.microsoft.com/office/2006/metadata/properties" xmlns:xsi="http://www.w3.org/2001/XMLSchema-instance" xmlns:pc="http://schemas.microsoft.com/office/infopath/2007/PartnerControls">
-  <documentManagement>
-    <lcf76f155ced4ddcb4097134ff3c332f xmlns="08383384-0503-4771-b2ba-6fc3d51bf656">
-      <Terms xmlns="http://schemas.microsoft.com/office/infopath/2007/PartnerControls"/>
-    </lcf76f155ced4ddcb4097134ff3c332f>
-    <TaxCatchAll xmlns="c0acec82-785e-4a01-8b49-a31886450b92" xsi:nil="true"/>
-  </documentManagement>
-</p:properties>
+<b:Sources xmlns:b="http://schemas.openxmlformats.org/officeDocument/2006/bibliography" xmlns="http://schemas.openxmlformats.org/officeDocument/2006/bibliography" SelectedStyle="\APASixthEditionOfficeOnline.xsl" StyleName="APA" Version="6"/>
 </file>
 
 <file path=customXml/item4.xml><?xml version="1.0" encoding="utf-8"?>
@@ -4512,9 +4678,12 @@
 </file>
 
 <file path=customXml/itemProps1.xml><?xml version="1.0" encoding="utf-8"?>
-<ds:datastoreItem xmlns:ds="http://schemas.openxmlformats.org/officeDocument/2006/customXml" ds:itemID="{C077093E-3BC1-48A6-8480-2DA9C69EAEE0}">
+<ds:datastoreItem xmlns:ds="http://schemas.openxmlformats.org/officeDocument/2006/customXml" ds:itemID="{B4284606-6258-4C09-90D8-5C84A71D11A6}">
   <ds:schemaRefs>
-    <ds:schemaRef ds:uri="http://schemas.openxmlformats.org/officeDocument/2006/bibliography"/>
+    <ds:schemaRef ds:uri="http://schemas.microsoft.com/office/2006/metadata/properties"/>
+    <ds:schemaRef ds:uri="http://schemas.microsoft.com/office/infopath/2007/PartnerControls"/>
+    <ds:schemaRef ds:uri="08383384-0503-4771-b2ba-6fc3d51bf656"/>
+    <ds:schemaRef ds:uri="c0acec82-785e-4a01-8b49-a31886450b92"/>
   </ds:schemaRefs>
 </ds:datastoreItem>
 </file>
@@ -4528,12 +4697,9 @@
 </file>
 
 <file path=customXml/itemProps3.xml><?xml version="1.0" encoding="utf-8"?>
-<ds:datastoreItem xmlns:ds="http://schemas.openxmlformats.org/officeDocument/2006/customXml" ds:itemID="{B4284606-6258-4C09-90D8-5C84A71D11A6}">
+<ds:datastoreItem xmlns:ds="http://schemas.openxmlformats.org/officeDocument/2006/customXml" ds:itemID="{C077093E-3BC1-48A6-8480-2DA9C69EAEE0}">
   <ds:schemaRefs>
-    <ds:schemaRef ds:uri="http://schemas.microsoft.com/office/2006/metadata/properties"/>
-    <ds:schemaRef ds:uri="http://schemas.microsoft.com/office/infopath/2007/PartnerControls"/>
-    <ds:schemaRef ds:uri="08383384-0503-4771-b2ba-6fc3d51bf656"/>
-    <ds:schemaRef ds:uri="c0acec82-785e-4a01-8b49-a31886450b92"/>
+    <ds:schemaRef ds:uri="http://schemas.openxmlformats.org/officeDocument/2006/bibliography"/>
   </ds:schemaRefs>
 </ds:datastoreItem>
 </file>

</xml_diff>

<commit_message>
opmaak spelersprofiel en finetunen posities
</commit_message>
<xml_diff>
--- a/To-do's.docx
+++ b/To-do's.docx
@@ -220,24 +220,42 @@
           <w:ilvl w:val="0"/>
           <w:numId w:val="16"/>
         </w:numPr>
+        <w:rPr>
+          <w:strike/>
+        </w:rPr>
       </w:pPr>
       <w:proofErr w:type="gramStart"/>
       <w:r>
+        <w:rPr>
+          <w:strike/>
+        </w:rPr>
         <w:t>Top speler</w:t>
       </w:r>
       <w:proofErr w:type="gramEnd"/>
       <w:r>
+        <w:rPr>
+          <w:strike/>
+        </w:rPr>
         <w:t xml:space="preserve"> sterretje mag goud worden weergegeven.</w:t>
       </w:r>
       <w:r>
+        <w:rPr>
+          <w:strike/>
+        </w:rPr>
         <w:t xml:space="preserve"> Kan dit niet </w:t>
       </w:r>
       <w:proofErr w:type="spellStart"/>
       <w:r>
+        <w:rPr>
+          <w:strike/>
+        </w:rPr>
         <w:t>ivm</w:t>
       </w:r>
       <w:proofErr w:type="spellEnd"/>
       <w:r>
+        <w:rPr>
+          <w:strike/>
+        </w:rPr>
         <w:t xml:space="preserve"> de naam, dan laten we het zo.</w:t>
       </w:r>
     </w:p>
@@ -360,8 +378,14 @@
           <w:ilvl w:val="0"/>
           <w:numId w:val="17"/>
         </w:numPr>
-      </w:pPr>
-      <w:r>
+        <w:rPr>
+          <w:strike/>
+        </w:rPr>
+      </w:pPr>
+      <w:r>
+        <w:rPr>
+          <w:strike/>
+        </w:rPr>
         <w:t>Terug knop moet navigeren naar interne spelers als het een interne speler betreft.</w:t>
       </w:r>
     </w:p>
@@ -384,11 +408,20 @@
           <w:ilvl w:val="0"/>
           <w:numId w:val="17"/>
         </w:numPr>
-      </w:pPr>
-      <w:r>
+        <w:rPr>
+          <w:strike/>
+        </w:rPr>
+      </w:pPr>
+      <w:r>
+        <w:rPr>
+          <w:strike/>
+        </w:rPr>
         <w:t xml:space="preserve">Interne situatie </w:t>
       </w:r>
       <w:r>
+        <w:rPr>
+          <w:strike/>
+        </w:rPr>
         <w:t xml:space="preserve">kaart mag in twee kolommen weergegeven worden, dan is de kaart ook wat minder lang. </w:t>
       </w:r>
     </w:p>
@@ -399,15 +432,84 @@
           <w:ilvl w:val="0"/>
           <w:numId w:val="17"/>
         </w:numPr>
+        <w:rPr>
+          <w:strike/>
+        </w:rPr>
       </w:pPr>
       <w:proofErr w:type="gramStart"/>
       <w:r>
+        <w:rPr>
+          <w:strike/>
+        </w:rPr>
         <w:lastRenderedPageBreak/>
         <w:t>Top talent</w:t>
       </w:r>
       <w:proofErr w:type="gramEnd"/>
       <w:r>
+        <w:rPr>
+          <w:strike/>
+        </w:rPr>
         <w:t xml:space="preserve"> ster mag achter de naam worden weergegeven, net zoals bij de spelerstabel. Dan kan dit uit de kart gehaald worden.</w:t>
+      </w:r>
+    </w:p>
+    <w:p>
+      <w:pPr>
+        <w:pStyle w:val="Lijstalinea"/>
+        <w:numPr>
+          <w:ilvl w:val="0"/>
+          <w:numId w:val="17"/>
+        </w:numPr>
+      </w:pPr>
+      <w:r>
+        <w:t xml:space="preserve">Interne situatie kaart aanpassingen: </w:t>
+      </w:r>
+    </w:p>
+    <w:p>
+      <w:pPr>
+        <w:pStyle w:val="Lijstalinea"/>
+        <w:numPr>
+          <w:ilvl w:val="1"/>
+          <w:numId w:val="17"/>
+        </w:numPr>
+      </w:pPr>
+      <w:r>
+        <w:t>Team mag eruit, staat al bij algemene info</w:t>
+      </w:r>
+    </w:p>
+    <w:p>
+      <w:pPr>
+        <w:pStyle w:val="Lijstalinea"/>
+        <w:numPr>
+          <w:ilvl w:val="1"/>
+          <w:numId w:val="17"/>
+        </w:numPr>
+      </w:pPr>
+      <w:r>
+        <w:t>Optie jaar mag eruit</w:t>
+      </w:r>
+    </w:p>
+    <w:p>
+      <w:pPr>
+        <w:pStyle w:val="Lijstalinea"/>
+        <w:numPr>
+          <w:ilvl w:val="1"/>
+          <w:numId w:val="17"/>
+        </w:numPr>
+      </w:pPr>
+      <w:r>
+        <w:t>Aantal KM van huis tot de club</w:t>
+      </w:r>
+    </w:p>
+    <w:p>
+      <w:pPr>
+        <w:pStyle w:val="Lijstalinea"/>
+        <w:numPr>
+          <w:ilvl w:val="1"/>
+          <w:numId w:val="17"/>
+        </w:numPr>
+      </w:pPr>
+      <w:r>
+        <w:t xml:space="preserve">Favoriete en beste positie wil ik weten, maar voor externe spelers heb ik positie en nevenpositie. Hoe kan ik dit eenduidig maken en wat is hierbij handig? </w:t>
       </w:r>
     </w:p>
     <w:p/>
@@ -749,7 +851,6 @@
         </w:numPr>
       </w:pPr>
       <w:r>
-        <w:lastRenderedPageBreak/>
         <w:t xml:space="preserve">Flow achter </w:t>
       </w:r>
       <w:r>
@@ -969,6 +1070,7 @@
         </w:numPr>
       </w:pPr>
       <w:r>
+        <w:lastRenderedPageBreak/>
         <w:t>Mogelijkheid om spelers uit te nodigen om intake formulier in te vullen</w:t>
       </w:r>
     </w:p>
@@ -1018,7 +1120,6 @@
         <w:pStyle w:val="Kop2"/>
       </w:pPr>
       <w:r>
-        <w:lastRenderedPageBreak/>
         <w:t>Instellingen</w:t>
       </w:r>
     </w:p>
@@ -2866,7 +2967,7 @@
         <w:ind w:left="720" w:hanging="360"/>
       </w:pPr>
     </w:lvl>
-    <w:lvl w:ilvl="1" w:tplc="04130019" w:tentative="1">
+    <w:lvl w:ilvl="1" w:tplc="04130019">
       <w:start w:val="1"/>
       <w:numFmt w:val="lowerLetter"/>
       <w:lvlText w:val="%2."/>

</xml_diff>

<commit_message>
opmaak modals bewerk/nieuwe speler
</commit_message>
<xml_diff>
--- a/To-do's.docx
+++ b/To-do's.docx
@@ -316,8 +316,14 @@
           <w:ilvl w:val="1"/>
           <w:numId w:val="16"/>
         </w:numPr>
-      </w:pPr>
-      <w:r>
+        <w:rPr>
+          <w:strike/>
+        </w:rPr>
+      </w:pPr>
+      <w:r>
+        <w:rPr>
+          <w:strike/>
+        </w:rPr>
         <w:t>Favoriete positie:</w:t>
       </w:r>
     </w:p>
@@ -330,6 +336,9 @@
         </w:numPr>
       </w:pPr>
       <w:r>
+        <w:rPr>
+          <w:strike/>
+        </w:rPr>
         <w:t>Beste positie:</w:t>
       </w:r>
     </w:p>
@@ -340,16 +349,28 @@
           <w:ilvl w:val="1"/>
           <w:numId w:val="16"/>
         </w:numPr>
-      </w:pPr>
-      <w:r>
+        <w:rPr>
+          <w:strike/>
+        </w:rPr>
+      </w:pPr>
+      <w:r>
+        <w:rPr>
+          <w:strike/>
+        </w:rPr>
         <w:t xml:space="preserve">Spelend lid bij </w:t>
       </w:r>
       <w:proofErr w:type="spellStart"/>
       <w:r>
+        <w:rPr>
+          <w:strike/>
+        </w:rPr>
         <w:t>sv</w:t>
       </w:r>
       <w:proofErr w:type="spellEnd"/>
       <w:r>
+        <w:rPr>
+          <w:strike/>
+        </w:rPr>
         <w:t xml:space="preserve"> Hillegom sinds het seizoen:</w:t>
       </w:r>
     </w:p>
@@ -459,8 +480,14 @@
           <w:ilvl w:val="0"/>
           <w:numId w:val="17"/>
         </w:numPr>
-      </w:pPr>
-      <w:r>
+        <w:rPr>
+          <w:strike/>
+        </w:rPr>
+      </w:pPr>
+      <w:r>
+        <w:rPr>
+          <w:strike/>
+        </w:rPr>
         <w:t xml:space="preserve">Interne situatie kaart aanpassingen: </w:t>
       </w:r>
     </w:p>
@@ -471,8 +498,14 @@
           <w:ilvl w:val="1"/>
           <w:numId w:val="17"/>
         </w:numPr>
-      </w:pPr>
-      <w:r>
+        <w:rPr>
+          <w:strike/>
+        </w:rPr>
+      </w:pPr>
+      <w:r>
+        <w:rPr>
+          <w:strike/>
+        </w:rPr>
         <w:t>Team mag eruit, staat al bij algemene info</w:t>
       </w:r>
     </w:p>
@@ -483,8 +516,14 @@
           <w:ilvl w:val="1"/>
           <w:numId w:val="17"/>
         </w:numPr>
-      </w:pPr>
-      <w:r>
+        <w:rPr>
+          <w:strike/>
+        </w:rPr>
+      </w:pPr>
+      <w:r>
+        <w:rPr>
+          <w:strike/>
+        </w:rPr>
         <w:t>Optie jaar mag eruit</w:t>
       </w:r>
     </w:p>
@@ -495,8 +534,14 @@
           <w:ilvl w:val="1"/>
           <w:numId w:val="17"/>
         </w:numPr>
-      </w:pPr>
-      <w:r>
+        <w:rPr>
+          <w:strike/>
+        </w:rPr>
+      </w:pPr>
+      <w:r>
+        <w:rPr>
+          <w:strike/>
+        </w:rPr>
         <w:t>Aantal KM van huis tot de club</w:t>
       </w:r>
     </w:p>
@@ -507,8 +552,14 @@
           <w:ilvl w:val="1"/>
           <w:numId w:val="17"/>
         </w:numPr>
-      </w:pPr>
-      <w:r>
+        <w:rPr>
+          <w:strike/>
+        </w:rPr>
+      </w:pPr>
+      <w:r>
+        <w:rPr>
+          <w:strike/>
+        </w:rPr>
         <w:t xml:space="preserve">Favoriete en beste positie wil ik weten, maar voor externe spelers heb ik positie en nevenpositie. Hoe kan ik dit eenduidig maken en wat is hierbij handig? </w:t>
       </w:r>
     </w:p>

</xml_diff>

<commit_message>
toevoegen componenten playerform en taskform
</commit_message>
<xml_diff>
--- a/To-do's.docx
+++ b/To-do's.docx
@@ -23,12 +23,14 @@
           <w:lang w:val="en-US"/>
         </w:rPr>
       </w:pPr>
+      <w:proofErr w:type="spellStart"/>
       <w:r>
         <w:rPr>
           <w:lang w:val="en-US"/>
         </w:rPr>
         <w:t>Topbar</w:t>
       </w:r>
+      <w:proofErr w:type="spellEnd"/>
     </w:p>
     <w:p>
       <w:pPr>
@@ -86,12 +88,14 @@
           <w:lang w:val="en-US"/>
         </w:rPr>
       </w:pPr>
+      <w:proofErr w:type="spellStart"/>
       <w:r>
         <w:rPr>
           <w:lang w:val="en-US"/>
         </w:rPr>
         <w:t>Spelers</w:t>
       </w:r>
+      <w:proofErr w:type="spellEnd"/>
     </w:p>
     <w:p>
       <w:pPr>
@@ -104,11 +108,19 @@
           <w:strike/>
         </w:rPr>
       </w:pPr>
-      <w:r>
-        <w:rPr>
-          <w:strike/>
-        </w:rPr>
-        <w:t>Toggle extern/intern in het midden weergeven</w:t>
+      <w:proofErr w:type="spellStart"/>
+      <w:r>
+        <w:rPr>
+          <w:strike/>
+        </w:rPr>
+        <w:t>Toggle</w:t>
+      </w:r>
+      <w:proofErr w:type="spellEnd"/>
+      <w:r>
+        <w:rPr>
+          <w:strike/>
+        </w:rPr>
+        <w:t xml:space="preserve"> extern/intern in het midden weergeven</w:t>
       </w:r>
       <w:r>
         <w:rPr>
@@ -212,17 +224,39 @@
           <w:strike/>
         </w:rPr>
       </w:pPr>
-      <w:r>
-        <w:rPr>
-          <w:strike/>
-        </w:rPr>
-        <w:t>Top speler sterretje mag goud worden weergegeven.</w:t>
-      </w:r>
-      <w:r>
-        <w:rPr>
-          <w:strike/>
-        </w:rPr>
-        <w:t xml:space="preserve"> Kan dit niet ivm de naam, dan laten we het zo.</w:t>
+      <w:proofErr w:type="gramStart"/>
+      <w:r>
+        <w:rPr>
+          <w:strike/>
+        </w:rPr>
+        <w:t>Top speler</w:t>
+      </w:r>
+      <w:proofErr w:type="gramEnd"/>
+      <w:r>
+        <w:rPr>
+          <w:strike/>
+        </w:rPr>
+        <w:t xml:space="preserve"> sterretje mag goud worden weergegeven.</w:t>
+      </w:r>
+      <w:r>
+        <w:rPr>
+          <w:strike/>
+        </w:rPr>
+        <w:t xml:space="preserve"> Kan dit niet </w:t>
+      </w:r>
+      <w:proofErr w:type="spellStart"/>
+      <w:r>
+        <w:rPr>
+          <w:strike/>
+        </w:rPr>
+        <w:t>ivm</w:t>
+      </w:r>
+      <w:proofErr w:type="spellEnd"/>
+      <w:r>
+        <w:rPr>
+          <w:strike/>
+        </w:rPr>
+        <w:t xml:space="preserve"> de naam, dan laten we het zo.</w:t>
       </w:r>
     </w:p>
     <w:p>
@@ -264,7 +298,15 @@
         </w:numPr>
       </w:pPr>
       <w:r>
-        <w:t>Reistijd van huis tot en met sv Hillegom:</w:t>
+        <w:t xml:space="preserve">Reistijd van huis tot en met </w:t>
+      </w:r>
+      <w:proofErr w:type="spellStart"/>
+      <w:r>
+        <w:t>sv</w:t>
+      </w:r>
+      <w:proofErr w:type="spellEnd"/>
+      <w:r>
+        <w:t xml:space="preserve"> Hillegom:</w:t>
       </w:r>
     </w:p>
     <w:p>
@@ -315,7 +357,21 @@
         <w:rPr>
           <w:strike/>
         </w:rPr>
-        <w:t>Spelend lid bij sv Hillegom sinds het seizoen:</w:t>
+        <w:t xml:space="preserve">Spelend lid bij </w:t>
+      </w:r>
+      <w:proofErr w:type="spellStart"/>
+      <w:r>
+        <w:rPr>
+          <w:strike/>
+        </w:rPr>
+        <w:t>sv</w:t>
+      </w:r>
+      <w:proofErr w:type="spellEnd"/>
+      <w:r>
+        <w:rPr>
+          <w:strike/>
+        </w:rPr>
+        <w:t xml:space="preserve"> Hillegom sinds het seizoen:</w:t>
       </w:r>
     </w:p>
     <w:p>
@@ -401,12 +457,20 @@
           <w:strike/>
         </w:rPr>
       </w:pPr>
+      <w:proofErr w:type="gramStart"/>
       <w:r>
         <w:rPr>
           <w:strike/>
         </w:rPr>
         <w:lastRenderedPageBreak/>
-        <w:t>Top talent ster mag achter de naam worden weergegeven, net zoals bij de spelerstabel. Dan kan dit uit de kart gehaald worden.</w:t>
+        <w:t>Top talent</w:t>
+      </w:r>
+      <w:proofErr w:type="gramEnd"/>
+      <w:r>
+        <w:rPr>
+          <w:strike/>
+        </w:rPr>
+        <w:t xml:space="preserve"> ster mag achter de naam worden weergegeven, net zoals bij de spelerstabel. Dan kan dit uit de kart gehaald worden.</w:t>
       </w:r>
     </w:p>
     <w:p>
@@ -558,8 +622,13 @@
       <w:r>
         <w:t xml:space="preserve"> </w:t>
       </w:r>
-      <w:r>
-        <w:t xml:space="preserve">modal </w:t>
+      <w:proofErr w:type="spellStart"/>
+      <w:r>
+        <w:t>modal</w:t>
+      </w:r>
+      <w:proofErr w:type="spellEnd"/>
+      <w:r>
+        <w:t xml:space="preserve"> </w:t>
       </w:r>
       <w:r>
         <w:t xml:space="preserve">maken </w:t>
@@ -580,7 +649,15 @@
         </w:numPr>
       </w:pPr>
       <w:r>
-        <w:t>Instellingen modal maken</w:t>
+        <w:t xml:space="preserve">Instellingen </w:t>
+      </w:r>
+      <w:proofErr w:type="spellStart"/>
+      <w:r>
+        <w:t>modal</w:t>
+      </w:r>
+      <w:proofErr w:type="spellEnd"/>
+      <w:r>
+        <w:t xml:space="preserve"> maken</w:t>
       </w:r>
       <w:r>
         <w:t xml:space="preserve"> waar je kunt vastleggen welke teams je wilt vastleggen, welke opstellingen je wilt, max leeftijd</w:t>
@@ -612,8 +689,13 @@
           <w:numId w:val="19"/>
         </w:numPr>
       </w:pPr>
-      <w:r>
-        <w:t xml:space="preserve">Toggle </w:t>
+      <w:proofErr w:type="spellStart"/>
+      <w:r>
+        <w:t>Toggle</w:t>
+      </w:r>
+      <w:proofErr w:type="spellEnd"/>
+      <w:r>
+        <w:t xml:space="preserve"> </w:t>
       </w:r>
       <w:r>
         <w:t xml:space="preserve">wordt vreemd vormgegeven. Mag gecentreerd in het midden worden weergeven en niet over de hele breedte. </w:t>
@@ -633,11 +715,32 @@
           <w:numId w:val="19"/>
         </w:numPr>
       </w:pPr>
-      <w:r>
-        <w:t>Top talent mag worden top speler.</w:t>
-      </w:r>
-      <w:r>
-        <w:t xml:space="preserve"> Geef dit weer naast de toggle intern/extern. </w:t>
+      <w:proofErr w:type="gramStart"/>
+      <w:r>
+        <w:t>Top talent</w:t>
+      </w:r>
+      <w:proofErr w:type="gramEnd"/>
+      <w:r>
+        <w:t xml:space="preserve"> mag worden </w:t>
+      </w:r>
+      <w:proofErr w:type="gramStart"/>
+      <w:r>
+        <w:t>top speler</w:t>
+      </w:r>
+      <w:proofErr w:type="gramEnd"/>
+      <w:r>
+        <w:t>.</w:t>
+      </w:r>
+      <w:r>
+        <w:t xml:space="preserve"> Geef dit weer naast de </w:t>
+      </w:r>
+      <w:proofErr w:type="spellStart"/>
+      <w:r>
+        <w:t>toggle</w:t>
+      </w:r>
+      <w:proofErr w:type="spellEnd"/>
+      <w:r>
+        <w:t xml:space="preserve"> intern/extern. </w:t>
       </w:r>
     </w:p>
     <w:p>
@@ -649,7 +752,23 @@
         </w:numPr>
       </w:pPr>
       <w:r>
-        <w:t xml:space="preserve">Option year mag er uit. </w:t>
+        <w:t xml:space="preserve">Option </w:t>
+      </w:r>
+      <w:proofErr w:type="spellStart"/>
+      <w:r>
+        <w:t>year</w:t>
+      </w:r>
+      <w:proofErr w:type="spellEnd"/>
+      <w:r>
+        <w:t xml:space="preserve"> mag </w:t>
+      </w:r>
+      <w:proofErr w:type="gramStart"/>
+      <w:r>
+        <w:t>er uit</w:t>
+      </w:r>
+      <w:proofErr w:type="gramEnd"/>
+      <w:r>
+        <w:t xml:space="preserve">. </w:t>
       </w:r>
     </w:p>
     <w:p>
@@ -661,7 +780,43 @@
         </w:numPr>
       </w:pPr>
       <w:r>
-        <w:t>Er staat nu zoveel informatie dat er een scroll ontstaat in de modal, deze wil ik voorkomen.</w:t>
+        <w:t xml:space="preserve">Er staat nu zoveel informatie dat er een </w:t>
+      </w:r>
+      <w:proofErr w:type="spellStart"/>
+      <w:r>
+        <w:t>scroll</w:t>
+      </w:r>
+      <w:proofErr w:type="spellEnd"/>
+      <w:r>
+        <w:t xml:space="preserve"> ontstaat in de </w:t>
+      </w:r>
+      <w:proofErr w:type="spellStart"/>
+      <w:r>
+        <w:t>modal</w:t>
+      </w:r>
+      <w:proofErr w:type="spellEnd"/>
+      <w:r>
+        <w:t>, deze wil ik voorkomen.</w:t>
+      </w:r>
+    </w:p>
+    <w:p>
+      <w:pPr>
+        <w:pStyle w:val="Lijstalinea"/>
+        <w:numPr>
+          <w:ilvl w:val="0"/>
+          <w:numId w:val="19"/>
+        </w:numPr>
+      </w:pPr>
+      <w:r>
+        <w:t xml:space="preserve">Inputvelden voor bij club en contract tot als seizoenen maken </w:t>
+      </w:r>
+      <w:proofErr w:type="spellStart"/>
+      <w:r>
+        <w:t>ipv</w:t>
+      </w:r>
+      <w:proofErr w:type="spellEnd"/>
+      <w:r>
+        <w:t xml:space="preserve"> datumveld</w:t>
       </w:r>
     </w:p>
     <w:p/>
@@ -739,6 +894,7 @@
         </w:numPr>
       </w:pPr>
       <w:r>
+        <w:lastRenderedPageBreak/>
         <w:t>Inputvelden onder elkaar weergeven</w:t>
       </w:r>
     </w:p>
@@ -751,7 +907,6 @@
         </w:numPr>
       </w:pPr>
       <w:r>
-        <w:lastRenderedPageBreak/>
         <w:t>Contact aanmaken vanuit contacten pagina</w:t>
       </w:r>
     </w:p>
@@ -836,7 +991,15 @@
         <w:t xml:space="preserve">Flow achter </w:t>
       </w:r>
       <w:r>
-        <w:t>gebruiker uitnodigen (e-mails versturen etc).</w:t>
+        <w:t xml:space="preserve">gebruiker uitnodigen (e-mails versturen </w:t>
+      </w:r>
+      <w:proofErr w:type="spellStart"/>
+      <w:r>
+        <w:t>etc</w:t>
+      </w:r>
+      <w:proofErr w:type="spellEnd"/>
+      <w:r>
+        <w:t>).</w:t>
       </w:r>
     </w:p>
     <w:p>
@@ -968,7 +1131,15 @@
         </w:numPr>
       </w:pPr>
       <w:r>
-        <w:t>Radar chart ook zichtbaar maken bij pop-up als je op naam speler gaat staan</w:t>
+        <w:t xml:space="preserve">Radar </w:t>
+      </w:r>
+      <w:proofErr w:type="spellStart"/>
+      <w:r>
+        <w:t>chart</w:t>
+      </w:r>
+      <w:proofErr w:type="spellEnd"/>
+      <w:r>
+        <w:t xml:space="preserve"> ook zichtbaar maken bij pop-up als je op naam speler gaat staan</w:t>
       </w:r>
     </w:p>
     <w:p>
@@ -980,7 +1151,15 @@
         </w:numPr>
       </w:pPr>
       <w:r>
-        <w:t>Kleuren voor processtappen etc?</w:t>
+        <w:t xml:space="preserve">Kleuren voor processtappen </w:t>
+      </w:r>
+      <w:proofErr w:type="spellStart"/>
+      <w:r>
+        <w:t>etc</w:t>
+      </w:r>
+      <w:proofErr w:type="spellEnd"/>
+      <w:r>
+        <w:t>?</w:t>
       </w:r>
     </w:p>
     <w:p/>
@@ -1000,9 +1179,19 @@
           <w:numId w:val="12"/>
         </w:numPr>
       </w:pPr>
-      <w:r>
-        <w:t>Two-Factor authentication</w:t>
-      </w:r>
+      <w:proofErr w:type="spellStart"/>
+      <w:r>
+        <w:t>Two</w:t>
+      </w:r>
+      <w:proofErr w:type="spellEnd"/>
+      <w:r>
+        <w:t xml:space="preserve">-Factor </w:t>
+      </w:r>
+      <w:proofErr w:type="spellStart"/>
+      <w:r>
+        <w:t>authentication</w:t>
+      </w:r>
+      <w:proofErr w:type="spellEnd"/>
     </w:p>
     <w:p>
       <w:pPr>
@@ -1013,7 +1202,15 @@
         </w:numPr>
       </w:pPr>
       <w:r>
-        <w:t>Demo omgeving van football-scouting-platform zelf</w:t>
+        <w:t xml:space="preserve">Demo omgeving van </w:t>
+      </w:r>
+      <w:proofErr w:type="spellStart"/>
+      <w:r>
+        <w:t>football</w:t>
+      </w:r>
+      <w:proofErr w:type="spellEnd"/>
+      <w:r>
+        <w:t>-scouting-platform zelf</w:t>
       </w:r>
       <w:r>
         <w:t xml:space="preserve"> om potentiële gebruikers inzicht te geven in</w:t>
@@ -1027,8 +1224,13 @@
           <w:numId w:val="12"/>
         </w:numPr>
       </w:pPr>
-      <w:r>
-        <w:t xml:space="preserve">SuperAdmin user aanmaken die in alle afzonderlijke omgevingen </w:t>
+      <w:proofErr w:type="spellStart"/>
+      <w:r>
+        <w:t>SuperAdmin</w:t>
+      </w:r>
+      <w:proofErr w:type="spellEnd"/>
+      <w:r>
+        <w:t xml:space="preserve"> user aanmaken die in alle afzonderlijke omgevingen </w:t>
       </w:r>
       <w:r>
         <w:t xml:space="preserve">van de clubs </w:t>
@@ -1050,8 +1252,29 @@
         <w:t>Pi</w:t>
       </w:r>
       <w:r>
-        <w:t>pelines van dev naar acc naar prod</w:t>
-      </w:r>
+        <w:t xml:space="preserve">pelines van </w:t>
+      </w:r>
+      <w:proofErr w:type="spellStart"/>
+      <w:r>
+        <w:t>dev</w:t>
+      </w:r>
+      <w:proofErr w:type="spellEnd"/>
+      <w:r>
+        <w:t xml:space="preserve"> naar </w:t>
+      </w:r>
+      <w:proofErr w:type="spellStart"/>
+      <w:r>
+        <w:t>acc</w:t>
+      </w:r>
+      <w:proofErr w:type="spellEnd"/>
+      <w:r>
+        <w:t xml:space="preserve"> naar </w:t>
+      </w:r>
+      <w:proofErr w:type="spellStart"/>
+      <w:r>
+        <w:t>prod</w:t>
+      </w:r>
+      <w:proofErr w:type="spellEnd"/>
     </w:p>
     <w:p>
       <w:pPr>
@@ -1073,8 +1296,49 @@
           <w:numId w:val="14"/>
         </w:numPr>
       </w:pPr>
-      <w:r>
-        <w:t>Skeleton screens maken</w:t>
+      <w:proofErr w:type="spellStart"/>
+      <w:r>
+        <w:t>Skeleton</w:t>
+      </w:r>
+      <w:proofErr w:type="spellEnd"/>
+      <w:r>
+        <w:t xml:space="preserve"> </w:t>
+      </w:r>
+      <w:proofErr w:type="spellStart"/>
+      <w:r>
+        <w:t>screens</w:t>
+      </w:r>
+      <w:proofErr w:type="spellEnd"/>
+      <w:r>
+        <w:t xml:space="preserve"> maken</w:t>
+      </w:r>
+    </w:p>
+    <w:p>
+      <w:pPr>
+        <w:pStyle w:val="Lijstalinea"/>
+        <w:numPr>
+          <w:ilvl w:val="0"/>
+          <w:numId w:val="14"/>
+        </w:numPr>
+      </w:pPr>
+      <w:r>
+        <w:t xml:space="preserve">Audit </w:t>
+      </w:r>
+      <w:proofErr w:type="spellStart"/>
+      <w:r>
+        <w:t>trails</w:t>
+      </w:r>
+      <w:proofErr w:type="spellEnd"/>
+      <w:r>
+        <w:t xml:space="preserve"> en </w:t>
+      </w:r>
+      <w:proofErr w:type="spellStart"/>
+      <w:r>
+        <w:t>logging</w:t>
+      </w:r>
+      <w:proofErr w:type="spellEnd"/>
+      <w:r>
+        <w:t xml:space="preserve"> zodat we dingen kunnen terugdraaien</w:t>
       </w:r>
     </w:p>
     <w:p/>
@@ -1107,7 +1371,15 @@
         <w:t>nemen</w:t>
       </w:r>
       <w:r>
-        <w:t xml:space="preserve"> ivm vakantie Daní</w:t>
+        <w:t xml:space="preserve"> </w:t>
+      </w:r>
+      <w:proofErr w:type="spellStart"/>
+      <w:r>
+        <w:t>ivm</w:t>
+      </w:r>
+      <w:proofErr w:type="spellEnd"/>
+      <w:r>
+        <w:t xml:space="preserve"> vakantie Daní</w:t>
       </w:r>
       <w:r>
         <w:t xml:space="preserve"> --&gt; 30 maart wel?</w:t>
@@ -1152,7 +1424,15 @@
         <w:t xml:space="preserve"> </w:t>
       </w:r>
       <w:r>
-        <w:t>--&gt; even checken bij Daní ivm vakantie Cain (moest vast goedkomen)</w:t>
+        <w:t xml:space="preserve">--&gt; even checken bij Daní </w:t>
+      </w:r>
+      <w:proofErr w:type="spellStart"/>
+      <w:r>
+        <w:t>ivm</w:t>
+      </w:r>
+      <w:proofErr w:type="spellEnd"/>
+      <w:r>
+        <w:t xml:space="preserve"> vakantie Cain (moest vast goedkomen)</w:t>
       </w:r>
     </w:p>
     <w:p>
@@ -1164,7 +1444,15 @@
         </w:numPr>
       </w:pPr>
       <w:r>
-        <w:t>1 mei kids bij je ouders slapen</w:t>
+        <w:t xml:space="preserve">1 mei </w:t>
+      </w:r>
+      <w:proofErr w:type="spellStart"/>
+      <w:r>
+        <w:t>kids</w:t>
+      </w:r>
+      <w:proofErr w:type="spellEnd"/>
+      <w:r>
+        <w:t xml:space="preserve"> bij je ouders slapen</w:t>
       </w:r>
       <w:r>
         <w:t xml:space="preserve"> --&gt; top</w:t>
@@ -1182,18 +1470,40 @@
         <w:rPr>
           <w:lang w:val="de-DE"/>
         </w:rPr>
-        <w:t xml:space="preserve">7 t/m 9 mei weg --&gt; </w:t>
-      </w:r>
+        <w:t xml:space="preserve">7 t/m 9 </w:t>
+      </w:r>
+      <w:proofErr w:type="spellStart"/>
       <w:r>
         <w:rPr>
           <w:lang w:val="de-DE"/>
         </w:rPr>
-        <w:t>8 t/m 9 doen</w:t>
-      </w:r>
+        <w:t>mei</w:t>
+      </w:r>
+      <w:proofErr w:type="spellEnd"/>
       <w:r>
         <w:rPr>
           <w:lang w:val="de-DE"/>
         </w:rPr>
+        <w:t xml:space="preserve"> weg --&gt; </w:t>
+      </w:r>
+      <w:r>
+        <w:rPr>
+          <w:lang w:val="de-DE"/>
+        </w:rPr>
+        <w:t xml:space="preserve">8 t/m 9 </w:t>
+      </w:r>
+      <w:proofErr w:type="spellStart"/>
+      <w:r>
+        <w:rPr>
+          <w:lang w:val="de-DE"/>
+        </w:rPr>
+        <w:t>doen</w:t>
+      </w:r>
+      <w:proofErr w:type="spellEnd"/>
+      <w:r>
+        <w:rPr>
+          <w:lang w:val="de-DE"/>
+        </w:rPr>
         <w:t>?</w:t>
       </w:r>
       <w:r>
@@ -1206,7 +1516,15 @@
         <w:t>Z</w:t>
       </w:r>
       <w:r>
-        <w:t>al wel druk/duur zijn ivm vakantie</w:t>
+        <w:t xml:space="preserve">al wel druk/duur zijn </w:t>
+      </w:r>
+      <w:proofErr w:type="spellStart"/>
+      <w:r>
+        <w:t>ivm</w:t>
+      </w:r>
+      <w:proofErr w:type="spellEnd"/>
+      <w:r>
+        <w:t xml:space="preserve"> vakantie</w:t>
       </w:r>
       <w:r>
         <w:t xml:space="preserve"> en kan ik nog trainen</w:t>

</xml_diff>

<commit_message>
fix modal speler bewerken issues
</commit_message>
<xml_diff>
--- a/To-do's.docx
+++ b/To-do's.docx
@@ -85,6 +85,158 @@
           <w:lang w:val="en-US"/>
         </w:rPr>
       </w:pPr>
+      <w:r>
+        <w:rPr>
+          <w:lang w:val="en-US"/>
+        </w:rPr>
+        <w:t xml:space="preserve">Aantal </w:t>
+      </w:r>
+      <w:proofErr w:type="spellStart"/>
+      <w:r>
+        <w:rPr>
+          <w:lang w:val="en-US"/>
+        </w:rPr>
+        <w:t>spelers</w:t>
+      </w:r>
+      <w:proofErr w:type="spellEnd"/>
+      <w:r>
+        <w:rPr>
+          <w:lang w:val="en-US"/>
+        </w:rPr>
+        <w:t xml:space="preserve"> extern</w:t>
+      </w:r>
+    </w:p>
+    <w:p>
+      <w:pPr>
+        <w:pStyle w:val="Lijstalinea"/>
+        <w:numPr>
+          <w:ilvl w:val="0"/>
+          <w:numId w:val="23"/>
+        </w:numPr>
+        <w:rPr>
+          <w:lang w:val="en-US"/>
+        </w:rPr>
+      </w:pPr>
+      <w:r>
+        <w:rPr>
+          <w:lang w:val="en-US"/>
+        </w:rPr>
+        <w:t xml:space="preserve">Aantal </w:t>
+      </w:r>
+      <w:proofErr w:type="spellStart"/>
+      <w:r>
+        <w:rPr>
+          <w:lang w:val="en-US"/>
+        </w:rPr>
+        <w:t>spelers</w:t>
+      </w:r>
+      <w:proofErr w:type="spellEnd"/>
+      <w:r>
+        <w:rPr>
+          <w:lang w:val="en-US"/>
+        </w:rPr>
+        <w:t xml:space="preserve"> intern</w:t>
+      </w:r>
+    </w:p>
+    <w:p>
+      <w:pPr>
+        <w:pStyle w:val="Lijstalinea"/>
+        <w:numPr>
+          <w:ilvl w:val="0"/>
+          <w:numId w:val="23"/>
+        </w:numPr>
+        <w:rPr>
+          <w:lang w:val="en-US"/>
+        </w:rPr>
+      </w:pPr>
+      <w:proofErr w:type="spellStart"/>
+      <w:r>
+        <w:rPr>
+          <w:lang w:val="en-US"/>
+        </w:rPr>
+        <w:t>Openstaande</w:t>
+      </w:r>
+      <w:proofErr w:type="spellEnd"/>
+      <w:r>
+        <w:rPr>
+          <w:lang w:val="en-US"/>
+        </w:rPr>
+        <w:t xml:space="preserve"> taken</w:t>
+      </w:r>
+    </w:p>
+    <w:p>
+      <w:pPr>
+        <w:pStyle w:val="Lijstalinea"/>
+        <w:numPr>
+          <w:ilvl w:val="0"/>
+          <w:numId w:val="23"/>
+        </w:numPr>
+        <w:rPr>
+          <w:lang w:val="en-US"/>
+        </w:rPr>
+      </w:pPr>
+      <w:proofErr w:type="spellStart"/>
+      <w:r>
+        <w:rPr>
+          <w:lang w:val="en-US"/>
+        </w:rPr>
+        <w:t>Mijn</w:t>
+      </w:r>
+      <w:proofErr w:type="spellEnd"/>
+      <w:r>
+        <w:rPr>
+          <w:lang w:val="en-US"/>
+        </w:rPr>
+        <w:t xml:space="preserve"> </w:t>
+      </w:r>
+      <w:proofErr w:type="spellStart"/>
+      <w:r>
+        <w:rPr>
+          <w:lang w:val="en-US"/>
+        </w:rPr>
+        <w:t>openstaande</w:t>
+      </w:r>
+      <w:proofErr w:type="spellEnd"/>
+      <w:r>
+        <w:rPr>
+          <w:lang w:val="en-US"/>
+        </w:rPr>
+        <w:t xml:space="preserve"> taken</w:t>
+      </w:r>
+    </w:p>
+    <w:p>
+      <w:pPr>
+        <w:pStyle w:val="Lijstalinea"/>
+        <w:numPr>
+          <w:ilvl w:val="0"/>
+          <w:numId w:val="23"/>
+        </w:numPr>
+        <w:rPr>
+          <w:lang w:val="en-US"/>
+        </w:rPr>
+      </w:pPr>
+      <w:proofErr w:type="spellStart"/>
+      <w:r>
+        <w:rPr>
+          <w:lang w:val="en-US"/>
+        </w:rPr>
+        <w:t>Laatste</w:t>
+      </w:r>
+      <w:proofErr w:type="spellEnd"/>
+      <w:r>
+        <w:rPr>
+          <w:lang w:val="en-US"/>
+        </w:rPr>
+        <w:t xml:space="preserve"> 5 </w:t>
+      </w:r>
+      <w:proofErr w:type="spellStart"/>
+      <w:r>
+        <w:rPr>
+          <w:lang w:val="en-US"/>
+        </w:rPr>
+        <w:t>contacten</w:t>
+      </w:r>
+      <w:proofErr w:type="spellEnd"/>
     </w:p>
     <w:p>
       <w:pPr>
@@ -120,14 +272,100 @@
           <w:lang w:val="en-US"/>
         </w:rPr>
       </w:pPr>
-    </w:p>
-    <w:p>
-      <w:pPr>
+      <w:proofErr w:type="spellStart"/>
+      <w:r>
         <w:rPr>
           <w:lang w:val="en-US"/>
         </w:rPr>
-      </w:pPr>
-    </w:p>
+        <w:t>Niveau</w:t>
+      </w:r>
+      <w:proofErr w:type="spellEnd"/>
+      <w:r>
+        <w:rPr>
+          <w:lang w:val="en-US"/>
+        </w:rPr>
+        <w:t xml:space="preserve"> filter </w:t>
+      </w:r>
+      <w:proofErr w:type="spellStart"/>
+      <w:r>
+        <w:rPr>
+          <w:lang w:val="en-US"/>
+        </w:rPr>
+        <w:t>optie</w:t>
+      </w:r>
+      <w:proofErr w:type="spellEnd"/>
+    </w:p>
+    <w:p>
+      <w:pPr>
+        <w:pStyle w:val="Lijstalinea"/>
+        <w:numPr>
+          <w:ilvl w:val="0"/>
+          <w:numId w:val="16"/>
+        </w:numPr>
+        <w:rPr>
+          <w:lang w:val="en-US"/>
+        </w:rPr>
+      </w:pPr>
+      <w:proofErr w:type="spellStart"/>
+      <w:r>
+        <w:rPr>
+          <w:lang w:val="en-US"/>
+        </w:rPr>
+        <w:t>Toevoegen</w:t>
+      </w:r>
+      <w:proofErr w:type="spellEnd"/>
+      <w:r>
+        <w:rPr>
+          <w:lang w:val="en-US"/>
+        </w:rPr>
+        <w:t xml:space="preserve"> </w:t>
+      </w:r>
+      <w:r>
+        <w:rPr>
+          <w:lang w:val="en-US"/>
+        </w:rPr>
+        <w:t>speller</w:t>
+      </w:r>
+    </w:p>
+    <w:p>
+      <w:pPr>
+        <w:pStyle w:val="Lijstalinea"/>
+        <w:numPr>
+          <w:ilvl w:val="0"/>
+          <w:numId w:val="16"/>
+        </w:numPr>
+      </w:pPr>
+      <w:r>
+        <w:t>Mogelijkheid om speler te kunnen verwijderen</w:t>
+      </w:r>
+    </w:p>
+    <w:p>
+      <w:pPr>
+        <w:pStyle w:val="Lijstalinea"/>
+        <w:numPr>
+          <w:ilvl w:val="0"/>
+          <w:numId w:val="16"/>
+        </w:numPr>
+      </w:pPr>
+      <w:r>
+        <w:t xml:space="preserve">Club SV Hillegom staat standaard ingesteld bij extern, dit moet </w:t>
+      </w:r>
+      <w:r>
+        <w:t xml:space="preserve">alleen bij intern zo zijn. Bij intern </w:t>
+      </w:r>
+      <w:r>
+        <w:t xml:space="preserve">is het veld al </w:t>
+      </w:r>
+      <w:proofErr w:type="spellStart"/>
+      <w:r>
+        <w:t>gelocked</w:t>
+      </w:r>
+      <w:proofErr w:type="spellEnd"/>
+      <w:r>
+        <w:t xml:space="preserve">, maak het lettertype daar iets minder wit (zoals elders ook al gedaan is) zodat de gebruiker beter aanvoelt dat het daar niets mee hoeft te doen. Doe dit ook bij niveau. </w:t>
+      </w:r>
+    </w:p>
+    <w:p/>
     <w:p>
       <w:pPr>
         <w:pStyle w:val="Kop2"/>
@@ -148,12 +386,33 @@
         <w:t xml:space="preserve">Interne speler mag standaard de clubnaam als huidige club hebben. </w:t>
       </w:r>
     </w:p>
+    <w:p>
+      <w:pPr>
+        <w:pStyle w:val="Lijstalinea"/>
+        <w:numPr>
+          <w:ilvl w:val="0"/>
+          <w:numId w:val="17"/>
+        </w:numPr>
+      </w:pPr>
+      <w:r>
+        <w:t xml:space="preserve">Speler bewerken </w:t>
+      </w:r>
+      <w:proofErr w:type="spellStart"/>
+      <w:r>
+        <w:t>modal</w:t>
+      </w:r>
+      <w:proofErr w:type="spellEnd"/>
+      <w:r>
+        <w:t xml:space="preserve"> wordt gesloten na klikken op volgende. </w:t>
+      </w:r>
+    </w:p>
     <w:p/>
     <w:p>
       <w:pPr>
         <w:pStyle w:val="Kop2"/>
       </w:pPr>
       <w:r>
+        <w:lastRenderedPageBreak/>
         <w:t>Selectie</w:t>
       </w:r>
       <w:r>
@@ -184,19 +443,16 @@
         </w:numPr>
       </w:pPr>
       <w:r>
-        <w:t>Voetbalveld mooier weergeven. Iets langer maken (</w:t>
-      </w:r>
-      <w:r>
-        <w:t>meer naar onderen) en smaller maken. Ook tegeltjes voor posities</w:t>
-      </w:r>
-      <w:r>
-        <w:t xml:space="preserve"> iets kleiner maken door standaard maar 2 spelers te kunnen toevoegen. </w:t>
-      </w:r>
-      <w:r>
-        <w:t xml:space="preserve">Labels van de positie weghalen. </w:t>
-      </w:r>
-      <w:r>
-        <w:t xml:space="preserve">Ook kunnen de aanvallers nog wat meer naar boven, zodat het in het midden en onderin wat minder krap wordt. </w:t>
+        <w:t>Voetbalveld iets breder maken</w:t>
+      </w:r>
+      <w:r>
+        <w:t>, laten we de breedte pakken van de hele kaart die erachter zit. De blauwe lijn mag minder dik</w:t>
+      </w:r>
+      <w:r>
+        <w:t>. De 16 meter en 5 meter zijn geen doelgebied zoals het hoort. De ruimte voor de kaarten van de posities zijn prima zo, mogen zelfs een</w:t>
+      </w:r>
+      <w:r>
+        <w:t xml:space="preserve"> tikkeltje groter.</w:t>
       </w:r>
     </w:p>
     <w:p>
@@ -206,28 +462,52 @@
           <w:ilvl w:val="0"/>
           <w:numId w:val="20"/>
         </w:numPr>
-      </w:pPr>
-      <w:r>
+        <w:rPr>
+          <w:strike/>
+        </w:rPr>
+      </w:pPr>
+      <w:r>
+        <w:rPr>
+          <w:strike/>
+        </w:rPr>
         <w:t>Analyse</w:t>
       </w:r>
       <w:r>
+        <w:rPr>
+          <w:strike/>
+        </w:rPr>
         <w:t xml:space="preserve"> </w:t>
       </w:r>
       <w:proofErr w:type="spellStart"/>
       <w:r>
+        <w:rPr>
+          <w:strike/>
+        </w:rPr>
         <w:t>modal</w:t>
       </w:r>
       <w:proofErr w:type="spellEnd"/>
       <w:r>
+        <w:rPr>
+          <w:strike/>
+        </w:rPr>
         <w:t xml:space="preserve"> </w:t>
       </w:r>
       <w:r>
+        <w:rPr>
+          <w:strike/>
+        </w:rPr>
         <w:t xml:space="preserve">maken </w:t>
       </w:r>
       <w:r>
+        <w:rPr>
+          <w:strike/>
+        </w:rPr>
         <w:t>en activeren door knop?</w:t>
       </w:r>
       <w:r>
+        <w:rPr>
+          <w:strike/>
+        </w:rPr>
         <w:t xml:space="preserve"> </w:t>
       </w:r>
     </w:p>
@@ -257,13 +537,58 @@
         <w:t>.</w:t>
       </w:r>
     </w:p>
+    <w:p>
+      <w:pPr>
+        <w:pStyle w:val="Lijstalinea"/>
+        <w:numPr>
+          <w:ilvl w:val="0"/>
+          <w:numId w:val="20"/>
+        </w:numPr>
+      </w:pPr>
+      <w:r>
+        <w:t xml:space="preserve">Instellingen </w:t>
+      </w:r>
+      <w:proofErr w:type="spellStart"/>
+      <w:r>
+        <w:t>modal</w:t>
+      </w:r>
+      <w:proofErr w:type="spellEnd"/>
+      <w:r>
+        <w:t xml:space="preserve"> groter maken</w:t>
+      </w:r>
+      <w:r>
+        <w:t xml:space="preserve"> zodat alles netjes past</w:t>
+      </w:r>
+      <w:r>
+        <w:t xml:space="preserve"> en titel knop aanpassen naar instellingen.</w:t>
+      </w:r>
+    </w:p>
+    <w:p>
+      <w:pPr>
+        <w:pStyle w:val="Lijstalinea"/>
+        <w:numPr>
+          <w:ilvl w:val="0"/>
+          <w:numId w:val="20"/>
+        </w:numPr>
+      </w:pPr>
+      <w:proofErr w:type="spellStart"/>
+      <w:r>
+        <w:t>Toggle</w:t>
+      </w:r>
+      <w:proofErr w:type="spellEnd"/>
+      <w:r>
+        <w:t xml:space="preserve"> extern/intern hergebruiken van de component die we gemaakt hebben.</w:t>
+      </w:r>
+      <w:r>
+        <w:t xml:space="preserve"> Standaard intern aangeklikt. </w:t>
+      </w:r>
+    </w:p>
     <w:p/>
     <w:p>
       <w:pPr>
         <w:pStyle w:val="Kop2"/>
       </w:pPr>
       <w:r>
-        <w:lastRenderedPageBreak/>
         <w:t>Bewerk</w:t>
       </w:r>
       <w:r>
@@ -461,6 +786,7 @@
       </w:pPr>
       <w:proofErr w:type="spellStart"/>
       <w:r>
+        <w:lastRenderedPageBreak/>
         <w:t>Superadmin</w:t>
       </w:r>
       <w:proofErr w:type="spellEnd"/>
@@ -495,23 +821,289 @@
         <w:t>Inkomsten kunnen inzien</w:t>
       </w:r>
     </w:p>
-    <w:p/>
-    <w:p>
-      <w:pPr>
-        <w:pStyle w:val="Kop2"/>
-      </w:pPr>
-      <w:r>
-        <w:t>Nieuwe pagina’s</w:t>
-      </w:r>
-    </w:p>
     <w:p>
       <w:pPr>
         <w:pStyle w:val="Lijstalinea"/>
         <w:numPr>
           <w:ilvl w:val="0"/>
-          <w:numId w:val="13"/>
+          <w:numId w:val="21"/>
         </w:numPr>
       </w:pPr>
+      <w:r>
+        <w:t xml:space="preserve">Pagina super </w:t>
+      </w:r>
+      <w:proofErr w:type="spellStart"/>
+      <w:r>
+        <w:t>admin</w:t>
+      </w:r>
+      <w:proofErr w:type="spellEnd"/>
+      <w:r>
+        <w:t xml:space="preserve"> standaard in oranje kleu</w:t>
+      </w:r>
+      <w:r>
+        <w:t>r? En de club die geselecteerd is oranje?</w:t>
+      </w:r>
+    </w:p>
+    <w:p/>
+    <w:p/>
+    <w:p>
+      <w:pPr>
+        <w:pStyle w:val="Kop1"/>
+      </w:pPr>
+      <w:r>
+        <w:t>Post MVP</w:t>
+      </w:r>
+    </w:p>
+    <w:p>
+      <w:pPr>
+        <w:pStyle w:val="Kop2"/>
+      </w:pPr>
+      <w:r>
+        <w:t>Spelers</w:t>
+      </w:r>
+    </w:p>
+    <w:p>
+      <w:pPr>
+        <w:pStyle w:val="Lijstalinea"/>
+        <w:numPr>
+          <w:ilvl w:val="0"/>
+          <w:numId w:val="9"/>
+        </w:numPr>
+      </w:pPr>
+      <w:r>
+        <w:t>Functie om iemand door te zetten van extern naar intern</w:t>
+      </w:r>
+    </w:p>
+    <w:p>
+      <w:pPr>
+        <w:pStyle w:val="Lijstalinea"/>
+        <w:numPr>
+          <w:ilvl w:val="0"/>
+          <w:numId w:val="9"/>
+        </w:numPr>
+      </w:pPr>
+      <w:r>
+        <w:t>Mogelijkheid om spelers uit te nodigen om intake formulier in te vullen</w:t>
+      </w:r>
+    </w:p>
+    <w:p>
+      <w:pPr>
+        <w:pStyle w:val="Lijstalinea"/>
+        <w:numPr>
+          <w:ilvl w:val="0"/>
+          <w:numId w:val="9"/>
+        </w:numPr>
+      </w:pPr>
+      <w:r>
+        <w:t xml:space="preserve">Radar </w:t>
+      </w:r>
+      <w:proofErr w:type="spellStart"/>
+      <w:r>
+        <w:t>chart</w:t>
+      </w:r>
+      <w:proofErr w:type="spellEnd"/>
+      <w:r>
+        <w:t xml:space="preserve"> ook zichtbaar maken bij pop-up als je op naam speler gaat staan</w:t>
+      </w:r>
+    </w:p>
+    <w:p>
+      <w:pPr>
+        <w:pStyle w:val="Lijstalinea"/>
+        <w:numPr>
+          <w:ilvl w:val="0"/>
+          <w:numId w:val="9"/>
+        </w:numPr>
+      </w:pPr>
+      <w:r>
+        <w:t xml:space="preserve">Kleuren voor processtappen </w:t>
+      </w:r>
+      <w:proofErr w:type="spellStart"/>
+      <w:r>
+        <w:t>etc</w:t>
+      </w:r>
+      <w:proofErr w:type="spellEnd"/>
+      <w:r>
+        <w:t>?</w:t>
+      </w:r>
+    </w:p>
+    <w:p/>
+    <w:p>
+      <w:pPr>
+        <w:pStyle w:val="Kop2"/>
+      </w:pPr>
+      <w:r>
+        <w:t>Instellingen</w:t>
+      </w:r>
+    </w:p>
+    <w:p>
+      <w:pPr>
+        <w:pStyle w:val="Lijstalinea"/>
+        <w:numPr>
+          <w:ilvl w:val="0"/>
+          <w:numId w:val="12"/>
+        </w:numPr>
+      </w:pPr>
+      <w:proofErr w:type="spellStart"/>
+      <w:r>
+        <w:t>Two</w:t>
+      </w:r>
+      <w:proofErr w:type="spellEnd"/>
+      <w:r>
+        <w:t xml:space="preserve">-Factor </w:t>
+      </w:r>
+      <w:proofErr w:type="spellStart"/>
+      <w:r>
+        <w:t>authentication</w:t>
+      </w:r>
+      <w:proofErr w:type="spellEnd"/>
+    </w:p>
+    <w:p>
+      <w:pPr>
+        <w:pStyle w:val="Lijstalinea"/>
+        <w:numPr>
+          <w:ilvl w:val="0"/>
+          <w:numId w:val="12"/>
+        </w:numPr>
+      </w:pPr>
+      <w:r>
+        <w:t xml:space="preserve">Demo omgeving van </w:t>
+      </w:r>
+      <w:proofErr w:type="spellStart"/>
+      <w:r>
+        <w:t>football</w:t>
+      </w:r>
+      <w:proofErr w:type="spellEnd"/>
+      <w:r>
+        <w:t>-scouting-platform zelf</w:t>
+      </w:r>
+      <w:r>
+        <w:t xml:space="preserve"> om potentiële gebruikers inzicht te geven in</w:t>
+      </w:r>
+    </w:p>
+    <w:p>
+      <w:pPr>
+        <w:pStyle w:val="Lijstalinea"/>
+        <w:numPr>
+          <w:ilvl w:val="0"/>
+          <w:numId w:val="12"/>
+        </w:numPr>
+      </w:pPr>
+      <w:proofErr w:type="spellStart"/>
+      <w:r>
+        <w:t>SuperAdmin</w:t>
+      </w:r>
+      <w:proofErr w:type="spellEnd"/>
+      <w:r>
+        <w:t xml:space="preserve"> user aanmaken die in alle afzonderlijke omgevingen </w:t>
+      </w:r>
+      <w:r>
+        <w:t xml:space="preserve">van de clubs </w:t>
+      </w:r>
+      <w:r>
+        <w:t>kan</w:t>
+      </w:r>
+    </w:p>
+    <w:p/>
+    <w:p>
+      <w:pPr>
+        <w:pStyle w:val="Lijstalinea"/>
+        <w:numPr>
+          <w:ilvl w:val="0"/>
+          <w:numId w:val="14"/>
+        </w:numPr>
+      </w:pPr>
+      <w:r>
+        <w:t>Pi</w:t>
+      </w:r>
+      <w:r>
+        <w:t xml:space="preserve">pelines van </w:t>
+      </w:r>
+      <w:proofErr w:type="spellStart"/>
+      <w:r>
+        <w:t>dev</w:t>
+      </w:r>
+      <w:proofErr w:type="spellEnd"/>
+      <w:r>
+        <w:t xml:space="preserve"> naar </w:t>
+      </w:r>
+      <w:proofErr w:type="spellStart"/>
+      <w:r>
+        <w:t>acc</w:t>
+      </w:r>
+      <w:proofErr w:type="spellEnd"/>
+      <w:r>
+        <w:t xml:space="preserve"> naar </w:t>
+      </w:r>
+      <w:proofErr w:type="spellStart"/>
+      <w:r>
+        <w:t>prod</w:t>
+      </w:r>
+      <w:proofErr w:type="spellEnd"/>
+    </w:p>
+    <w:p>
+      <w:pPr>
+        <w:pStyle w:val="Lijstalinea"/>
+        <w:numPr>
+          <w:ilvl w:val="0"/>
+          <w:numId w:val="14"/>
+        </w:numPr>
+      </w:pPr>
+      <w:r>
+        <w:t>Zelfde voor de databases</w:t>
+      </w:r>
+    </w:p>
+    <w:p>
+      <w:pPr>
+        <w:pStyle w:val="Lijstalinea"/>
+        <w:numPr>
+          <w:ilvl w:val="0"/>
+          <w:numId w:val="14"/>
+        </w:numPr>
+      </w:pPr>
+      <w:proofErr w:type="spellStart"/>
+      <w:r>
+        <w:t>Skeleton</w:t>
+      </w:r>
+      <w:proofErr w:type="spellEnd"/>
+      <w:r>
+        <w:t xml:space="preserve"> </w:t>
+      </w:r>
+      <w:proofErr w:type="spellStart"/>
+      <w:r>
+        <w:t>screens</w:t>
+      </w:r>
+      <w:proofErr w:type="spellEnd"/>
+      <w:r>
+        <w:t xml:space="preserve"> maken</w:t>
+      </w:r>
+    </w:p>
+    <w:p>
+      <w:pPr>
+        <w:pStyle w:val="Lijstalinea"/>
+        <w:numPr>
+          <w:ilvl w:val="0"/>
+          <w:numId w:val="14"/>
+        </w:numPr>
+      </w:pPr>
+      <w:r>
+        <w:t xml:space="preserve">Audit </w:t>
+      </w:r>
+      <w:proofErr w:type="spellStart"/>
+      <w:r>
+        <w:t>trails</w:t>
+      </w:r>
+      <w:proofErr w:type="spellEnd"/>
+      <w:r>
+        <w:t xml:space="preserve"> en </w:t>
+      </w:r>
+      <w:proofErr w:type="spellStart"/>
+      <w:r>
+        <w:t>logging</w:t>
+      </w:r>
+      <w:proofErr w:type="spellEnd"/>
+      <w:r>
+        <w:t xml:space="preserve"> zodat we dingen kunnen terugdraaien</w:t>
+      </w:r>
     </w:p>
     <w:p/>
     <w:p/>
@@ -520,280 +1112,9 @@
     <w:p/>
     <w:p/>
     <w:p/>
-    <w:p/>
-    <w:p/>
-    <w:p/>
-    <w:p/>
-    <w:p/>
-    <w:p/>
-    <w:p/>
-    <w:p/>
-    <w:p/>
-    <w:p>
-      <w:pPr>
-        <w:pStyle w:val="Kop1"/>
-      </w:pPr>
-      <w:r>
-        <w:t>Post MVP</w:t>
-      </w:r>
-    </w:p>
-    <w:p>
-      <w:pPr>
-        <w:pStyle w:val="Kop2"/>
-      </w:pPr>
-      <w:r>
-        <w:t>Spelers</w:t>
-      </w:r>
-    </w:p>
-    <w:p>
-      <w:pPr>
-        <w:pStyle w:val="Lijstalinea"/>
-        <w:numPr>
-          <w:ilvl w:val="0"/>
-          <w:numId w:val="9"/>
-        </w:numPr>
-      </w:pPr>
-      <w:r>
-        <w:t>Functie om iemand door te zetten van extern naar intern</w:t>
-      </w:r>
-    </w:p>
-    <w:p>
-      <w:pPr>
-        <w:pStyle w:val="Lijstalinea"/>
-        <w:numPr>
-          <w:ilvl w:val="0"/>
-          <w:numId w:val="9"/>
-        </w:numPr>
-      </w:pPr>
-      <w:r>
-        <w:t>Mogelijkheid om spelers uit te nodigen om intake formulier in te vullen</w:t>
-      </w:r>
-    </w:p>
-    <w:p>
-      <w:pPr>
-        <w:pStyle w:val="Lijstalinea"/>
-        <w:numPr>
-          <w:ilvl w:val="0"/>
-          <w:numId w:val="9"/>
-        </w:numPr>
-      </w:pPr>
-      <w:r>
-        <w:t xml:space="preserve">Radar </w:t>
-      </w:r>
-      <w:proofErr w:type="spellStart"/>
-      <w:r>
-        <w:t>chart</w:t>
-      </w:r>
-      <w:proofErr w:type="spellEnd"/>
-      <w:r>
-        <w:t xml:space="preserve"> ook zichtbaar maken bij pop-up als je op naam speler gaat staan</w:t>
-      </w:r>
-    </w:p>
-    <w:p>
-      <w:pPr>
-        <w:pStyle w:val="Lijstalinea"/>
-        <w:numPr>
-          <w:ilvl w:val="0"/>
-          <w:numId w:val="9"/>
-        </w:numPr>
-      </w:pPr>
-      <w:r>
-        <w:t xml:space="preserve">Kleuren voor processtappen </w:t>
-      </w:r>
-      <w:proofErr w:type="spellStart"/>
-      <w:r>
-        <w:t>etc</w:t>
-      </w:r>
-      <w:proofErr w:type="spellEnd"/>
-      <w:r>
-        <w:t>?</w:t>
-      </w:r>
-    </w:p>
-    <w:p/>
-    <w:p>
-      <w:pPr>
-        <w:pStyle w:val="Kop2"/>
-      </w:pPr>
-      <w:r>
-        <w:t>Instellingen</w:t>
-      </w:r>
-    </w:p>
-    <w:p>
-      <w:pPr>
-        <w:pStyle w:val="Lijstalinea"/>
-        <w:numPr>
-          <w:ilvl w:val="0"/>
-          <w:numId w:val="12"/>
-        </w:numPr>
-      </w:pPr>
-      <w:proofErr w:type="spellStart"/>
-      <w:r>
-        <w:t>Two</w:t>
-      </w:r>
-      <w:proofErr w:type="spellEnd"/>
-      <w:r>
-        <w:t xml:space="preserve">-Factor </w:t>
-      </w:r>
-      <w:proofErr w:type="spellStart"/>
-      <w:r>
-        <w:t>authentication</w:t>
-      </w:r>
-      <w:proofErr w:type="spellEnd"/>
-    </w:p>
-    <w:p>
-      <w:pPr>
-        <w:pStyle w:val="Lijstalinea"/>
-        <w:numPr>
-          <w:ilvl w:val="0"/>
-          <w:numId w:val="12"/>
-        </w:numPr>
-      </w:pPr>
-      <w:r>
-        <w:t xml:space="preserve">Demo omgeving van </w:t>
-      </w:r>
-      <w:proofErr w:type="spellStart"/>
-      <w:r>
-        <w:t>football</w:t>
-      </w:r>
-      <w:proofErr w:type="spellEnd"/>
-      <w:r>
-        <w:t>-scouting-platform zelf</w:t>
-      </w:r>
-      <w:r>
-        <w:t xml:space="preserve"> om potentiële gebruikers inzicht te geven in</w:t>
-      </w:r>
-    </w:p>
-    <w:p>
-      <w:pPr>
-        <w:pStyle w:val="Lijstalinea"/>
-        <w:numPr>
-          <w:ilvl w:val="0"/>
-          <w:numId w:val="12"/>
-        </w:numPr>
-      </w:pPr>
-      <w:proofErr w:type="spellStart"/>
-      <w:r>
-        <w:t>SuperAdmin</w:t>
-      </w:r>
-      <w:proofErr w:type="spellEnd"/>
-      <w:r>
-        <w:t xml:space="preserve"> user aanmaken die in alle afzonderlijke omgevingen </w:t>
-      </w:r>
-      <w:r>
-        <w:t xml:space="preserve">van de clubs </w:t>
-      </w:r>
-      <w:r>
-        <w:t>kan</w:t>
-      </w:r>
-    </w:p>
-    <w:p/>
-    <w:p>
-      <w:pPr>
-        <w:pStyle w:val="Lijstalinea"/>
-        <w:numPr>
-          <w:ilvl w:val="0"/>
-          <w:numId w:val="14"/>
-        </w:numPr>
-      </w:pPr>
-      <w:r>
-        <w:t>Pi</w:t>
-      </w:r>
-      <w:r>
-        <w:t xml:space="preserve">pelines van </w:t>
-      </w:r>
-      <w:proofErr w:type="spellStart"/>
-      <w:r>
-        <w:t>dev</w:t>
-      </w:r>
-      <w:proofErr w:type="spellEnd"/>
-      <w:r>
-        <w:t xml:space="preserve"> naar </w:t>
-      </w:r>
-      <w:proofErr w:type="spellStart"/>
-      <w:r>
-        <w:t>acc</w:t>
-      </w:r>
-      <w:proofErr w:type="spellEnd"/>
-      <w:r>
-        <w:t xml:space="preserve"> naar </w:t>
-      </w:r>
-      <w:proofErr w:type="spellStart"/>
-      <w:r>
-        <w:t>prod</w:t>
-      </w:r>
-      <w:proofErr w:type="spellEnd"/>
-    </w:p>
-    <w:p>
-      <w:pPr>
-        <w:pStyle w:val="Lijstalinea"/>
-        <w:numPr>
-          <w:ilvl w:val="0"/>
-          <w:numId w:val="14"/>
-        </w:numPr>
-      </w:pPr>
-      <w:r>
-        <w:t>Zelfde voor de databases</w:t>
-      </w:r>
-    </w:p>
-    <w:p>
-      <w:pPr>
-        <w:pStyle w:val="Lijstalinea"/>
-        <w:numPr>
-          <w:ilvl w:val="0"/>
-          <w:numId w:val="14"/>
-        </w:numPr>
-      </w:pPr>
-      <w:proofErr w:type="spellStart"/>
-      <w:r>
-        <w:t>Skeleton</w:t>
-      </w:r>
-      <w:proofErr w:type="spellEnd"/>
-      <w:r>
-        <w:t xml:space="preserve"> </w:t>
-      </w:r>
-      <w:proofErr w:type="spellStart"/>
-      <w:r>
-        <w:t>screens</w:t>
-      </w:r>
-      <w:proofErr w:type="spellEnd"/>
-      <w:r>
-        <w:t xml:space="preserve"> maken</w:t>
-      </w:r>
-    </w:p>
-    <w:p>
-      <w:pPr>
-        <w:pStyle w:val="Lijstalinea"/>
-        <w:numPr>
-          <w:ilvl w:val="0"/>
-          <w:numId w:val="14"/>
-        </w:numPr>
-      </w:pPr>
-      <w:r>
-        <w:t xml:space="preserve">Audit </w:t>
-      </w:r>
-      <w:proofErr w:type="spellStart"/>
-      <w:r>
-        <w:t>trails</w:t>
-      </w:r>
-      <w:proofErr w:type="spellEnd"/>
-      <w:r>
-        <w:t xml:space="preserve"> en </w:t>
-      </w:r>
-      <w:proofErr w:type="spellStart"/>
-      <w:r>
-        <w:t>logging</w:t>
-      </w:r>
-      <w:proofErr w:type="spellEnd"/>
-      <w:r>
-        <w:t xml:space="preserve"> zodat we dingen kunnen terugdraaien</w:t>
-      </w:r>
-    </w:p>
-    <w:p/>
-    <w:p/>
-    <w:p/>
-    <w:p/>
-    <w:p>
-      <w:r>
+    <w:p>
+      <w:r>
+        <w:lastRenderedPageBreak/>
         <w:t>In chronologische volgorde:</w:t>
       </w:r>
     </w:p>
@@ -806,7 +1127,6 @@
         </w:numPr>
       </w:pPr>
       <w:r>
-        <w:lastRenderedPageBreak/>
         <w:t>1</w:t>
       </w:r>
       <w:r>
@@ -4876,7 +5196,14 @@
 </file>
 
 <file path=customXml/item1.xml><?xml version="1.0" encoding="utf-8"?>
-<b:Sources xmlns:b="http://schemas.openxmlformats.org/officeDocument/2006/bibliography" xmlns="http://schemas.openxmlformats.org/officeDocument/2006/bibliography" SelectedStyle="\APASixthEditionOfficeOnline.xsl" StyleName="APA" Version="6"/>
+<p:properties xmlns:p="http://schemas.microsoft.com/office/2006/metadata/properties" xmlns:xsi="http://www.w3.org/2001/XMLSchema-instance" xmlns:pc="http://schemas.microsoft.com/office/infopath/2007/PartnerControls">
+  <documentManagement>
+    <lcf76f155ced4ddcb4097134ff3c332f xmlns="08383384-0503-4771-b2ba-6fc3d51bf656">
+      <Terms xmlns="http://schemas.microsoft.com/office/infopath/2007/PartnerControls"/>
+    </lcf76f155ced4ddcb4097134ff3c332f>
+    <TaxCatchAll xmlns="c0acec82-785e-4a01-8b49-a31886450b92" xsi:nil="true"/>
+  </documentManagement>
+</p:properties>
 </file>
 
 <file path=customXml/item2.xml><?xml version="1.0" encoding="utf-8"?>
@@ -4889,14 +5216,7 @@
 </file>
 
 <file path=customXml/item3.xml><?xml version="1.0" encoding="utf-8"?>
-<p:properties xmlns:p="http://schemas.microsoft.com/office/2006/metadata/properties" xmlns:xsi="http://www.w3.org/2001/XMLSchema-instance" xmlns:pc="http://schemas.microsoft.com/office/infopath/2007/PartnerControls">
-  <documentManagement>
-    <lcf76f155ced4ddcb4097134ff3c332f xmlns="08383384-0503-4771-b2ba-6fc3d51bf656">
-      <Terms xmlns="http://schemas.microsoft.com/office/infopath/2007/PartnerControls"/>
-    </lcf76f155ced4ddcb4097134ff3c332f>
-    <TaxCatchAll xmlns="c0acec82-785e-4a01-8b49-a31886450b92" xsi:nil="true"/>
-  </documentManagement>
-</p:properties>
+<b:Sources xmlns:b="http://schemas.openxmlformats.org/officeDocument/2006/bibliography" xmlns="http://schemas.openxmlformats.org/officeDocument/2006/bibliography" SelectedStyle="\APASixthEditionOfficeOnline.xsl" StyleName="APA" Version="6"/>
 </file>
 
 <file path=customXml/item4.xml><?xml version="1.0" encoding="utf-8"?>
@@ -5107,9 +5427,12 @@
 </file>
 
 <file path=customXml/itemProps1.xml><?xml version="1.0" encoding="utf-8"?>
-<ds:datastoreItem xmlns:ds="http://schemas.openxmlformats.org/officeDocument/2006/customXml" ds:itemID="{C077093E-3BC1-48A6-8480-2DA9C69EAEE0}">
+<ds:datastoreItem xmlns:ds="http://schemas.openxmlformats.org/officeDocument/2006/customXml" ds:itemID="{B4284606-6258-4C09-90D8-5C84A71D11A6}">
   <ds:schemaRefs>
-    <ds:schemaRef ds:uri="http://schemas.openxmlformats.org/officeDocument/2006/bibliography"/>
+    <ds:schemaRef ds:uri="http://schemas.microsoft.com/office/2006/metadata/properties"/>
+    <ds:schemaRef ds:uri="http://schemas.microsoft.com/office/infopath/2007/PartnerControls"/>
+    <ds:schemaRef ds:uri="08383384-0503-4771-b2ba-6fc3d51bf656"/>
+    <ds:schemaRef ds:uri="c0acec82-785e-4a01-8b49-a31886450b92"/>
   </ds:schemaRefs>
 </ds:datastoreItem>
 </file>
@@ -5123,12 +5446,9 @@
 </file>
 
 <file path=customXml/itemProps3.xml><?xml version="1.0" encoding="utf-8"?>
-<ds:datastoreItem xmlns:ds="http://schemas.openxmlformats.org/officeDocument/2006/customXml" ds:itemID="{B4284606-6258-4C09-90D8-5C84A71D11A6}">
+<ds:datastoreItem xmlns:ds="http://schemas.openxmlformats.org/officeDocument/2006/customXml" ds:itemID="{C077093E-3BC1-48A6-8480-2DA9C69EAEE0}">
   <ds:schemaRefs>
-    <ds:schemaRef ds:uri="http://schemas.microsoft.com/office/2006/metadata/properties"/>
-    <ds:schemaRef ds:uri="http://schemas.microsoft.com/office/infopath/2007/PartnerControls"/>
-    <ds:schemaRef ds:uri="08383384-0503-4771-b2ba-6fc3d51bf656"/>
-    <ds:schemaRef ds:uri="c0acec82-785e-4a01-8b49-a31886450b92"/>
+    <ds:schemaRef ds:uri="http://schemas.openxmlformats.org/officeDocument/2006/bibliography"/>
   </ds:schemaRefs>
 </ds:datastoreItem>
 </file>

</xml_diff>

<commit_message>
Implement skeleton loading and 2FA flow
Made-with: Cursor
</commit_message>
<xml_diff>
--- a/To-do's.docx
+++ b/To-do's.docx
@@ -23,12 +23,14 @@
           <w:lang w:val="en-US"/>
         </w:rPr>
       </w:pPr>
+      <w:proofErr w:type="spellStart"/>
       <w:r>
         <w:rPr>
           <w:lang w:val="en-US"/>
         </w:rPr>
         <w:t>Topbar</w:t>
       </w:r>
+      <w:proofErr w:type="spellEnd"/>
     </w:p>
     <w:p>
       <w:pPr>
@@ -212,12 +214,14 @@
           <w:lang w:val="en-US"/>
         </w:rPr>
       </w:pPr>
+      <w:proofErr w:type="spellStart"/>
       <w:r>
         <w:rPr>
           <w:lang w:val="en-US"/>
         </w:rPr>
         <w:t>Spelers</w:t>
       </w:r>
+      <w:proofErr w:type="spellEnd"/>
     </w:p>
     <w:p>
       <w:pPr>
@@ -227,6 +231,28 @@
           <w:numId w:val="16"/>
         </w:numPr>
       </w:pPr>
+      <w:r>
+        <w:t xml:space="preserve">Select </w:t>
+      </w:r>
+      <w:proofErr w:type="spellStart"/>
+      <w:r>
+        <w:t>all</w:t>
+      </w:r>
+      <w:proofErr w:type="spellEnd"/>
+      <w:r>
+        <w:t xml:space="preserve"> </w:t>
+      </w:r>
+      <w:proofErr w:type="spellStart"/>
+      <w:r>
+        <w:t>checkbox</w:t>
+      </w:r>
+      <w:proofErr w:type="spellEnd"/>
+      <w:r>
+        <w:t xml:space="preserve"> beter uitlijnen </w:t>
+      </w:r>
+      <w:r>
+        <w:t>met zoekveld bij naam</w:t>
+      </w:r>
     </w:p>
     <w:p/>
     <w:p>
@@ -307,10 +333,23 @@
         <w:t xml:space="preserve">Instellingen </w:t>
       </w:r>
       <w:r>
-        <w:t xml:space="preserve">en anaylyse </w:t>
-      </w:r>
-      <w:r>
-        <w:t>modal groter maken</w:t>
+        <w:t xml:space="preserve">en </w:t>
+      </w:r>
+      <w:proofErr w:type="spellStart"/>
+      <w:r>
+        <w:t>anaylyse</w:t>
+      </w:r>
+      <w:proofErr w:type="spellEnd"/>
+      <w:r>
+        <w:t xml:space="preserve"> </w:t>
+      </w:r>
+      <w:proofErr w:type="spellStart"/>
+      <w:r>
+        <w:t>modal</w:t>
+      </w:r>
+      <w:proofErr w:type="spellEnd"/>
+      <w:r>
+        <w:t xml:space="preserve"> groter maken</w:t>
       </w:r>
       <w:r>
         <w:t xml:space="preserve"> voor meer ruimte.</w:t>
@@ -347,7 +386,15 @@
         </w:numPr>
       </w:pPr>
       <w:r>
-        <w:t xml:space="preserve">Wanneer je een taak bekijkt is de omlijning van de modal niet blauw. Daarnaast opmaak wat mooier maken en wellicht mogelijk maken om het te wijzigen? </w:t>
+        <w:t xml:space="preserve">Wanneer je een taak bekijkt is de omlijning van de </w:t>
+      </w:r>
+      <w:proofErr w:type="spellStart"/>
+      <w:r>
+        <w:t>modal</w:t>
+      </w:r>
+      <w:proofErr w:type="spellEnd"/>
+      <w:r>
+        <w:t xml:space="preserve"> niet blauw. Daarnaast opmaak wat mooier maken en wellicht mogelijk maken om het te wijzigen? </w:t>
       </w:r>
     </w:p>
     <w:p/>
@@ -368,7 +415,15 @@
         </w:numPr>
       </w:pPr>
       <w:r>
-        <w:t xml:space="preserve">Contactmoment klikbaar maken zodat ook de notities zichtbaar zijn. En mogelijk maken om de </w:t>
+        <w:t xml:space="preserve">Contactmoment </w:t>
+      </w:r>
+      <w:proofErr w:type="spellStart"/>
+      <w:r>
+        <w:t>klikbaar</w:t>
+      </w:r>
+      <w:proofErr w:type="spellEnd"/>
+      <w:r>
+        <w:t xml:space="preserve"> maken zodat ook de notities zichtbaar zijn. En mogelijk maken om de </w:t>
       </w:r>
       <w:r>
         <w:t>contacten te wijzigen?</w:t>
@@ -455,7 +510,15 @@
         <w:t xml:space="preserve">Flow achter </w:t>
       </w:r>
       <w:r>
-        <w:t>gebruiker uitnodigen (e-mails versturen etc).</w:t>
+        <w:t xml:space="preserve">gebruiker uitnodigen (e-mails versturen </w:t>
+      </w:r>
+      <w:proofErr w:type="spellStart"/>
+      <w:r>
+        <w:t>etc</w:t>
+      </w:r>
+      <w:proofErr w:type="spellEnd"/>
+      <w:r>
+        <w:t>).</w:t>
       </w:r>
     </w:p>
     <w:p/>
@@ -463,9 +526,11 @@
       <w:pPr>
         <w:pStyle w:val="Kop2"/>
       </w:pPr>
+      <w:proofErr w:type="spellStart"/>
       <w:r>
         <w:t>Superadmin</w:t>
       </w:r>
+      <w:proofErr w:type="spellEnd"/>
     </w:p>
     <w:p/>
     <w:p/>
@@ -532,7 +597,15 @@
         </w:numPr>
       </w:pPr>
       <w:r>
-        <w:t>Radar chart ook zichtbaar maken bij pop-up als je op naam speler gaat staan</w:t>
+        <w:t xml:space="preserve">Radar </w:t>
+      </w:r>
+      <w:proofErr w:type="spellStart"/>
+      <w:r>
+        <w:t>chart</w:t>
+      </w:r>
+      <w:proofErr w:type="spellEnd"/>
+      <w:r>
+        <w:t xml:space="preserve"> ook zichtbaar maken bij pop-up als je op naam speler gaat staan</w:t>
       </w:r>
     </w:p>
     <w:p>
@@ -544,7 +617,15 @@
         </w:numPr>
       </w:pPr>
       <w:r>
-        <w:t>Kleuren voor processtappen etc?</w:t>
+        <w:t xml:space="preserve">Kleuren voor processtappen </w:t>
+      </w:r>
+      <w:proofErr w:type="spellStart"/>
+      <w:r>
+        <w:t>etc</w:t>
+      </w:r>
+      <w:proofErr w:type="spellEnd"/>
+      <w:r>
+        <w:t>?</w:t>
       </w:r>
     </w:p>
     <w:p/>
@@ -564,9 +645,19 @@
           <w:numId w:val="12"/>
         </w:numPr>
       </w:pPr>
-      <w:r>
-        <w:t>Two-Factor authentication</w:t>
-      </w:r>
+      <w:proofErr w:type="spellStart"/>
+      <w:r>
+        <w:t>Two</w:t>
+      </w:r>
+      <w:proofErr w:type="spellEnd"/>
+      <w:r>
+        <w:t xml:space="preserve">-Factor </w:t>
+      </w:r>
+      <w:proofErr w:type="spellStart"/>
+      <w:r>
+        <w:t>authentication</w:t>
+      </w:r>
+      <w:proofErr w:type="spellEnd"/>
     </w:p>
     <w:p>
       <w:pPr>
@@ -577,7 +668,15 @@
         </w:numPr>
       </w:pPr>
       <w:r>
-        <w:t>Demo omgeving van football-scouting-platform zelf</w:t>
+        <w:t xml:space="preserve">Demo omgeving van </w:t>
+      </w:r>
+      <w:proofErr w:type="spellStart"/>
+      <w:r>
+        <w:t>football</w:t>
+      </w:r>
+      <w:proofErr w:type="spellEnd"/>
+      <w:r>
+        <w:t>-scouting-platform zelf</w:t>
       </w:r>
       <w:r>
         <w:t xml:space="preserve"> om potentiële gebruikers inzicht te geven in</w:t>
@@ -596,8 +695,29 @@
         <w:t>Pi</w:t>
       </w:r>
       <w:r>
-        <w:t>pelines van dev naar acc naar prod</w:t>
-      </w:r>
+        <w:t xml:space="preserve">pelines van </w:t>
+      </w:r>
+      <w:proofErr w:type="spellStart"/>
+      <w:r>
+        <w:t>dev</w:t>
+      </w:r>
+      <w:proofErr w:type="spellEnd"/>
+      <w:r>
+        <w:t xml:space="preserve"> naar </w:t>
+      </w:r>
+      <w:proofErr w:type="spellStart"/>
+      <w:r>
+        <w:t>acc</w:t>
+      </w:r>
+      <w:proofErr w:type="spellEnd"/>
+      <w:r>
+        <w:t xml:space="preserve"> naar </w:t>
+      </w:r>
+      <w:proofErr w:type="spellStart"/>
+      <w:r>
+        <w:t>prod</w:t>
+      </w:r>
+      <w:proofErr w:type="spellEnd"/>
     </w:p>
     <w:p>
       <w:pPr>
@@ -619,8 +739,21 @@
           <w:numId w:val="14"/>
         </w:numPr>
       </w:pPr>
-      <w:r>
-        <w:t>Skeleton screens maken</w:t>
+      <w:proofErr w:type="spellStart"/>
+      <w:r>
+        <w:t>Skeleton</w:t>
+      </w:r>
+      <w:proofErr w:type="spellEnd"/>
+      <w:r>
+        <w:t xml:space="preserve"> </w:t>
+      </w:r>
+      <w:proofErr w:type="spellStart"/>
+      <w:r>
+        <w:t>screens</w:t>
+      </w:r>
+      <w:proofErr w:type="spellEnd"/>
+      <w:r>
+        <w:t xml:space="preserve"> maken</w:t>
       </w:r>
     </w:p>
     <w:p>
@@ -632,7 +765,23 @@
         </w:numPr>
       </w:pPr>
       <w:r>
-        <w:t>Audit trails en logging zodat we dingen kunnen terugdraaien</w:t>
+        <w:t xml:space="preserve">Audit </w:t>
+      </w:r>
+      <w:proofErr w:type="spellStart"/>
+      <w:r>
+        <w:t>trails</w:t>
+      </w:r>
+      <w:proofErr w:type="spellEnd"/>
+      <w:r>
+        <w:t xml:space="preserve"> en </w:t>
+      </w:r>
+      <w:proofErr w:type="spellStart"/>
+      <w:r>
+        <w:t>logging</w:t>
+      </w:r>
+      <w:proofErr w:type="spellEnd"/>
+      <w:r>
+        <w:t xml:space="preserve"> zodat we dingen kunnen terugdraaien</w:t>
       </w:r>
     </w:p>
     <w:p/>
@@ -863,7 +1012,7 @@
         <v:path o:extrusionok="f" gradientshapeok="t" o:connecttype="rect"/>
         <o:lock v:ext="edit" aspectratio="t"/>
       </v:shapetype>
-      <v:shape id="_x0000_i1025" type="#_x0000_t75" style="width:138.75pt;height:85.5pt" o:bullet="t">
+      <v:shape id="_x0000_i1025" type="#_x0000_t75" style="width:139pt;height:85.4pt" o:bullet="t">
         <v:imagedata r:id="rId1" o:title="Bloei symbool horizontaal"/>
       </v:shape>
     </w:pict>
@@ -4943,14 +5092,7 @@
 </file>
 
 <file path=customXml/item1.xml><?xml version="1.0" encoding="utf-8"?>
-<p:properties xmlns:p="http://schemas.microsoft.com/office/2006/metadata/properties" xmlns:xsi="http://www.w3.org/2001/XMLSchema-instance" xmlns:pc="http://schemas.microsoft.com/office/infopath/2007/PartnerControls">
-  <documentManagement>
-    <lcf76f155ced4ddcb4097134ff3c332f xmlns="08383384-0503-4771-b2ba-6fc3d51bf656">
-      <Terms xmlns="http://schemas.microsoft.com/office/infopath/2007/PartnerControls"/>
-    </lcf76f155ced4ddcb4097134ff3c332f>
-    <TaxCatchAll xmlns="c0acec82-785e-4a01-8b49-a31886450b92" xsi:nil="true"/>
-  </documentManagement>
-</p:properties>
+<b:Sources xmlns:b="http://schemas.openxmlformats.org/officeDocument/2006/bibliography" xmlns="http://schemas.openxmlformats.org/officeDocument/2006/bibliography" SelectedStyle="\APASixthEditionOfficeOnline.xsl" StyleName="APA" Version="6"/>
 </file>
 
 <file path=customXml/item2.xml><?xml version="1.0" encoding="utf-8"?>
@@ -4963,7 +5105,14 @@
 </file>
 
 <file path=customXml/item3.xml><?xml version="1.0" encoding="utf-8"?>
-<b:Sources xmlns:b="http://schemas.openxmlformats.org/officeDocument/2006/bibliography" xmlns="http://schemas.openxmlformats.org/officeDocument/2006/bibliography" SelectedStyle="\APASixthEditionOfficeOnline.xsl" StyleName="APA" Version="6"/>
+<p:properties xmlns:p="http://schemas.microsoft.com/office/2006/metadata/properties" xmlns:xsi="http://www.w3.org/2001/XMLSchema-instance" xmlns:pc="http://schemas.microsoft.com/office/infopath/2007/PartnerControls">
+  <documentManagement>
+    <lcf76f155ced4ddcb4097134ff3c332f xmlns="08383384-0503-4771-b2ba-6fc3d51bf656">
+      <Terms xmlns="http://schemas.microsoft.com/office/infopath/2007/PartnerControls"/>
+    </lcf76f155ced4ddcb4097134ff3c332f>
+    <TaxCatchAll xmlns="c0acec82-785e-4a01-8b49-a31886450b92" xsi:nil="true"/>
+  </documentManagement>
+</p:properties>
 </file>
 
 <file path=customXml/item4.xml><?xml version="1.0" encoding="utf-8"?>
@@ -5174,12 +5323,9 @@
 </file>
 
 <file path=customXml/itemProps1.xml><?xml version="1.0" encoding="utf-8"?>
-<ds:datastoreItem xmlns:ds="http://schemas.openxmlformats.org/officeDocument/2006/customXml" ds:itemID="{B4284606-6258-4C09-90D8-5C84A71D11A6}">
+<ds:datastoreItem xmlns:ds="http://schemas.openxmlformats.org/officeDocument/2006/customXml" ds:itemID="{C077093E-3BC1-48A6-8480-2DA9C69EAEE0}">
   <ds:schemaRefs>
-    <ds:schemaRef ds:uri="http://schemas.microsoft.com/office/2006/metadata/properties"/>
-    <ds:schemaRef ds:uri="http://schemas.microsoft.com/office/infopath/2007/PartnerControls"/>
-    <ds:schemaRef ds:uri="08383384-0503-4771-b2ba-6fc3d51bf656"/>
-    <ds:schemaRef ds:uri="c0acec82-785e-4a01-8b49-a31886450b92"/>
+    <ds:schemaRef ds:uri="http://schemas.openxmlformats.org/officeDocument/2006/bibliography"/>
   </ds:schemaRefs>
 </ds:datastoreItem>
 </file>
@@ -5193,9 +5339,12 @@
 </file>
 
 <file path=customXml/itemProps3.xml><?xml version="1.0" encoding="utf-8"?>
-<ds:datastoreItem xmlns:ds="http://schemas.openxmlformats.org/officeDocument/2006/customXml" ds:itemID="{C077093E-3BC1-48A6-8480-2DA9C69EAEE0}">
+<ds:datastoreItem xmlns:ds="http://schemas.openxmlformats.org/officeDocument/2006/customXml" ds:itemID="{B4284606-6258-4C09-90D8-5C84A71D11A6}">
   <ds:schemaRefs>
-    <ds:schemaRef ds:uri="http://schemas.openxmlformats.org/officeDocument/2006/bibliography"/>
+    <ds:schemaRef ds:uri="http://schemas.microsoft.com/office/2006/metadata/properties"/>
+    <ds:schemaRef ds:uri="http://schemas.microsoft.com/office/infopath/2007/PartnerControls"/>
+    <ds:schemaRef ds:uri="08383384-0503-4771-b2ba-6fc3d51bf656"/>
+    <ds:schemaRef ds:uri="c0acec82-785e-4a01-8b49-a31886450b92"/>
   </ds:schemaRefs>
 </ds:datastoreItem>
 </file>

</xml_diff>

<commit_message>
Werk To-do document bij
Made-with: Cursor
</commit_message>
<xml_diff>
--- a/To-do's.docx
+++ b/To-do's.docx
@@ -254,6 +254,47 @@
         <w:t>met zoekveld bij naam</w:t>
       </w:r>
     </w:p>
+    <w:p>
+      <w:pPr>
+        <w:pStyle w:val="Lijstalinea"/>
+        <w:numPr>
+          <w:ilvl w:val="0"/>
+          <w:numId w:val="16"/>
+        </w:numPr>
+        <w:rPr>
+          <w:strike/>
+        </w:rPr>
+      </w:pPr>
+      <w:r>
+        <w:rPr>
+          <w:strike/>
+        </w:rPr>
+        <w:t>Onthouden van de ingestelde kolommen die wel/niet getoond worden.</w:t>
+      </w:r>
+    </w:p>
+    <w:p>
+      <w:pPr>
+        <w:pStyle w:val="Lijstalinea"/>
+        <w:numPr>
+          <w:ilvl w:val="0"/>
+          <w:numId w:val="16"/>
+        </w:numPr>
+      </w:pPr>
+      <w:proofErr w:type="spellStart"/>
+      <w:r>
+        <w:t>Skeleton</w:t>
+      </w:r>
+      <w:proofErr w:type="spellEnd"/>
+      <w:r>
+        <w:t xml:space="preserve"> </w:t>
+      </w:r>
+      <w:r>
+        <w:t>screen</w:t>
+      </w:r>
+      <w:r>
+        <w:t xml:space="preserve"> mooier maken</w:t>
+      </w:r>
+    </w:p>
     <w:p/>
     <w:p>
       <w:pPr>
@@ -273,11 +314,13 @@
       </w:pPr>
     </w:p>
     <w:p/>
+    <w:p/>
     <w:p>
       <w:pPr>
         <w:pStyle w:val="Kop2"/>
       </w:pPr>
       <w:r>
+        <w:lastRenderedPageBreak/>
         <w:t>Selectie</w:t>
       </w:r>
       <w:r>
@@ -296,7 +339,10 @@
         <w:t>Items boven het voetbalveld naar rechts (of instellingen plaatsen)</w:t>
       </w:r>
       <w:r>
-        <w:t xml:space="preserve"> en titel van de pagina toevoegen.</w:t>
+        <w:t xml:space="preserve"> en titel van de pagina toevoegen</w:t>
+      </w:r>
+      <w:r>
+        <w:t>?</w:t>
       </w:r>
     </w:p>
     <w:p>
@@ -306,19 +352,55 @@
           <w:ilvl w:val="0"/>
           <w:numId w:val="20"/>
         </w:numPr>
-      </w:pPr>
-      <w:r>
-        <w:lastRenderedPageBreak/>
-        <w:t>Voetbalveld iets breder maken</w:t>
-      </w:r>
-      <w:r>
-        <w:t>, laten we de breedte pakken van de hele kaart die erachter zit. De blauwe lijn mag minder dik</w:t>
-      </w:r>
-      <w:r>
-        <w:t>. De 16 meter en 5 meter zijn geen doelgebied zoals het hoort. De ruimte voor de kaarten van de posities zijn prima zo, mogen zelfs een</w:t>
-      </w:r>
-      <w:r>
-        <w:t xml:space="preserve"> tikkeltje groter.</w:t>
+        <w:rPr>
+          <w:strike/>
+        </w:rPr>
+      </w:pPr>
+      <w:r>
+        <w:rPr>
+          <w:strike/>
+        </w:rPr>
+        <w:t xml:space="preserve">Instellingen </w:t>
+      </w:r>
+      <w:r>
+        <w:rPr>
+          <w:strike/>
+        </w:rPr>
+        <w:t xml:space="preserve">en </w:t>
+      </w:r>
+      <w:proofErr w:type="spellStart"/>
+      <w:r>
+        <w:rPr>
+          <w:strike/>
+        </w:rPr>
+        <w:t>anaylyse</w:t>
+      </w:r>
+      <w:proofErr w:type="spellEnd"/>
+      <w:r>
+        <w:rPr>
+          <w:strike/>
+        </w:rPr>
+        <w:t xml:space="preserve"> </w:t>
+      </w:r>
+      <w:proofErr w:type="spellStart"/>
+      <w:r>
+        <w:rPr>
+          <w:strike/>
+        </w:rPr>
+        <w:t>modal</w:t>
+      </w:r>
+      <w:proofErr w:type="spellEnd"/>
+      <w:r>
+        <w:rPr>
+          <w:strike/>
+        </w:rPr>
+        <w:t xml:space="preserve"> groter maken</w:t>
+      </w:r>
+      <w:r>
+        <w:rPr>
+          <w:strike/>
+        </w:rPr>
+        <w:t xml:space="preserve"> voor meer ruimte.</w:t>
       </w:r>
     </w:p>
     <w:p>
@@ -330,44 +412,9 @@
         </w:numPr>
       </w:pPr>
       <w:r>
-        <w:t xml:space="preserve">Instellingen </w:t>
-      </w:r>
-      <w:r>
-        <w:t xml:space="preserve">en </w:t>
-      </w:r>
-      <w:proofErr w:type="spellStart"/>
-      <w:r>
-        <w:t>anaylyse</w:t>
-      </w:r>
-      <w:proofErr w:type="spellEnd"/>
-      <w:r>
-        <w:t xml:space="preserve"> </w:t>
-      </w:r>
-      <w:proofErr w:type="spellStart"/>
-      <w:r>
-        <w:t>modal</w:t>
-      </w:r>
-      <w:proofErr w:type="spellEnd"/>
-      <w:r>
-        <w:t xml:space="preserve"> groter maken</w:t>
-      </w:r>
-      <w:r>
-        <w:t xml:space="preserve"> voor meer ruimte.</w:t>
+        <w:t>Selectie per team onthouden, dus één voor elk ingestelde team.</w:t>
       </w:r>
     </w:p>
-    <w:p>
-      <w:pPr>
-        <w:pStyle w:val="Lijstalinea"/>
-        <w:numPr>
-          <w:ilvl w:val="0"/>
-          <w:numId w:val="20"/>
-        </w:numPr>
-      </w:pPr>
-      <w:r>
-        <w:t>Opslaan van opstellingen in database per elftal en per seizoen, zodat dit niet telkens door de gebruiker gedaan hoeft te worden. Is het dan handig om dit per gebruiker te doen of standaard voor de hele club? Dat laatste is misschien onhandig voor als gebruikers opstellingen anders zien.</w:t>
-      </w:r>
-    </w:p>
-    <w:p/>
     <w:p/>
     <w:p>
       <w:pPr>
@@ -445,15 +492,20 @@
           <w:ilvl w:val="0"/>
           <w:numId w:val="11"/>
         </w:numPr>
-        <w:rPr>
-          <w:strike/>
-        </w:rPr>
-      </w:pPr>
-      <w:r>
-        <w:rPr>
-          <w:strike/>
-        </w:rPr>
-        <w:t>Header balk van tabel bij gebruikersbeheer is wit, hele tabel moet zelfde stijl hebben als tabel van spelers.</w:t>
+      </w:pPr>
+      <w:r>
+        <w:t xml:space="preserve">Flow achter </w:t>
+      </w:r>
+      <w:r>
+        <w:t xml:space="preserve">gebruiker uitnodigen (e-mails versturen </w:t>
+      </w:r>
+      <w:proofErr w:type="spellStart"/>
+      <w:r>
+        <w:t>etc</w:t>
+      </w:r>
+      <w:proofErr w:type="spellEnd"/>
+      <w:r>
+        <w:t>).</w:t>
       </w:r>
     </w:p>
     <w:p>
@@ -465,37 +517,7 @@
         </w:numPr>
       </w:pPr>
       <w:r>
-        <w:t>Acties bij gebruikers, zodat het mogelijk is om rechten in te trekken of te wijzigen</w:t>
-      </w:r>
-    </w:p>
-    <w:p>
-      <w:pPr>
-        <w:pStyle w:val="Lijstalinea"/>
-        <w:numPr>
-          <w:ilvl w:val="1"/>
-          <w:numId w:val="11"/>
-        </w:numPr>
-        <w:rPr>
-          <w:strike/>
-        </w:rPr>
-      </w:pPr>
-      <w:r>
-        <w:rPr>
-          <w:strike/>
-        </w:rPr>
-        <w:t>Vormgeving</w:t>
-      </w:r>
-    </w:p>
-    <w:p>
-      <w:pPr>
-        <w:pStyle w:val="Lijstalinea"/>
-        <w:numPr>
-          <w:ilvl w:val="1"/>
-          <w:numId w:val="11"/>
-        </w:numPr>
-      </w:pPr>
-      <w:r>
-        <w:t>Functionaliteit</w:t>
+        <w:t xml:space="preserve">2-FA instellen </w:t>
       </w:r>
     </w:p>
     <w:p>
@@ -507,18 +529,10 @@
         </w:numPr>
       </w:pPr>
       <w:r>
-        <w:t xml:space="preserve">Flow achter </w:t>
-      </w:r>
-      <w:r>
-        <w:t xml:space="preserve">gebruiker uitnodigen (e-mails versturen </w:t>
-      </w:r>
-      <w:proofErr w:type="spellStart"/>
-      <w:r>
-        <w:t>etc</w:t>
-      </w:r>
-      <w:proofErr w:type="spellEnd"/>
-      <w:r>
-        <w:t>).</w:t>
+        <w:t>Laatste scherm van spelers importeren</w:t>
+      </w:r>
+      <w:r>
+        <w:t xml:space="preserve"> met voltooien knop en navigeren naar spelers?</w:t>
       </w:r>
     </w:p>
     <w:p/>
@@ -539,7 +553,6 @@
         <w:pStyle w:val="Kop2"/>
       </w:pPr>
       <w:r>
-        <w:lastRenderedPageBreak/>
         <w:t>Clubprofiel</w:t>
       </w:r>
     </w:p>
@@ -560,6 +573,11 @@
     </w:p>
     <w:p/>
     <w:p/>
+    <w:p/>
+    <w:p/>
+    <w:p/>
+    <w:p/>
+    <w:p/>
     <w:p>
       <w:pPr>
         <w:pStyle w:val="Kop1"/>
@@ -587,6 +605,9 @@
       <w:r>
         <w:t>Mogelijkheid om spelers uit te nodigen om intake formulier in te vullen</w:t>
       </w:r>
+      <w:r>
+        <w:t>?</w:t>
+      </w:r>
     </w:p>
     <w:p>
       <w:pPr>
@@ -605,7 +626,16 @@
       </w:r>
       <w:proofErr w:type="spellEnd"/>
       <w:r>
-        <w:t xml:space="preserve"> ook zichtbaar maken bij pop-up als je op naam speler gaat staan</w:t>
+        <w:t xml:space="preserve"> </w:t>
+      </w:r>
+      <w:r>
+        <w:t xml:space="preserve">weer toevoegen en </w:t>
+      </w:r>
+      <w:r>
+        <w:t>ook zichtbaar maken bij pop-up als je op naam speler gaat staan</w:t>
+      </w:r>
+      <w:r>
+        <w:t>?</w:t>
       </w:r>
     </w:p>
     <w:p>
@@ -628,6 +658,18 @@
         <w:t>?</w:t>
       </w:r>
     </w:p>
+    <w:p>
+      <w:pPr>
+        <w:pStyle w:val="Lijstalinea"/>
+        <w:numPr>
+          <w:ilvl w:val="0"/>
+          <w:numId w:val="9"/>
+        </w:numPr>
+      </w:pPr>
+      <w:r>
+        <w:t>Wedstrijdstatistieken?</w:t>
+      </w:r>
+    </w:p>
     <w:p/>
     <w:p>
       <w:pPr>
@@ -685,6 +727,14 @@
     <w:p/>
     <w:p>
       <w:pPr>
+        <w:pStyle w:val="Kop2"/>
+      </w:pPr>
+      <w:r>
+        <w:t>Algemeen</w:t>
+      </w:r>
+    </w:p>
+    <w:p>
+      <w:pPr>
         <w:pStyle w:val="Lijstalinea"/>
         <w:numPr>
           <w:ilvl w:val="0"/>
@@ -739,21 +789,24 @@
           <w:numId w:val="14"/>
         </w:numPr>
       </w:pPr>
+      <w:r>
+        <w:t xml:space="preserve">Audit </w:t>
+      </w:r>
       <w:proofErr w:type="spellStart"/>
       <w:r>
-        <w:t>Skeleton</w:t>
+        <w:t>trails</w:t>
       </w:r>
       <w:proofErr w:type="spellEnd"/>
       <w:r>
-        <w:t xml:space="preserve"> </w:t>
+        <w:t xml:space="preserve"> en </w:t>
       </w:r>
       <w:proofErr w:type="spellStart"/>
       <w:r>
-        <w:t>screens</w:t>
+        <w:t>logging</w:t>
       </w:r>
       <w:proofErr w:type="spellEnd"/>
       <w:r>
-        <w:t xml:space="preserve"> maken</w:t>
+        <w:t xml:space="preserve"> zodat we dingen kunnen terugdraaien</w:t>
       </w:r>
     </w:p>
     <w:p>
@@ -764,24 +817,21 @@
           <w:numId w:val="14"/>
         </w:numPr>
       </w:pPr>
-      <w:r>
-        <w:t xml:space="preserve">Audit </w:t>
-      </w:r>
       <w:proofErr w:type="spellStart"/>
       <w:r>
-        <w:t>trails</w:t>
+        <w:t>Skeleton</w:t>
       </w:r>
       <w:proofErr w:type="spellEnd"/>
       <w:r>
-        <w:t xml:space="preserve"> en </w:t>
+        <w:t xml:space="preserve"> </w:t>
       </w:r>
       <w:proofErr w:type="spellStart"/>
       <w:r>
-        <w:t>logging</w:t>
+        <w:t>screens</w:t>
       </w:r>
       <w:proofErr w:type="spellEnd"/>
       <w:r>
-        <w:t xml:space="preserve"> zodat we dingen kunnen terugdraaien</w:t>
+        <w:t xml:space="preserve"> verbeteren en mooier opmaken</w:t>
       </w:r>
     </w:p>
     <w:p/>
@@ -1012,7 +1062,7 @@
         <v:path o:extrusionok="f" gradientshapeok="t" o:connecttype="rect"/>
         <o:lock v:ext="edit" aspectratio="t"/>
       </v:shapetype>
-      <v:shape id="_x0000_i1025" type="#_x0000_t75" style="width:139pt;height:85.4pt" o:bullet="t">
+      <v:shape id="_x0000_i1025" type="#_x0000_t75" style="width:138.5pt;height:85.5pt" o:bullet="t">
         <v:imagedata r:id="rId1" o:title="Bloei symbool horizontaal"/>
       </v:shape>
     </w:pict>
@@ -5092,7 +5142,14 @@
 </file>
 
 <file path=customXml/item1.xml><?xml version="1.0" encoding="utf-8"?>
-<b:Sources xmlns:b="http://schemas.openxmlformats.org/officeDocument/2006/bibliography" xmlns="http://schemas.openxmlformats.org/officeDocument/2006/bibliography" SelectedStyle="\APASixthEditionOfficeOnline.xsl" StyleName="APA" Version="6"/>
+<p:properties xmlns:p="http://schemas.microsoft.com/office/2006/metadata/properties" xmlns:xsi="http://www.w3.org/2001/XMLSchema-instance" xmlns:pc="http://schemas.microsoft.com/office/infopath/2007/PartnerControls">
+  <documentManagement>
+    <lcf76f155ced4ddcb4097134ff3c332f xmlns="08383384-0503-4771-b2ba-6fc3d51bf656">
+      <Terms xmlns="http://schemas.microsoft.com/office/infopath/2007/PartnerControls"/>
+    </lcf76f155ced4ddcb4097134ff3c332f>
+    <TaxCatchAll xmlns="c0acec82-785e-4a01-8b49-a31886450b92" xsi:nil="true"/>
+  </documentManagement>
+</p:properties>
 </file>
 
 <file path=customXml/item2.xml><?xml version="1.0" encoding="utf-8"?>
@@ -5105,14 +5162,7 @@
 </file>
 
 <file path=customXml/item3.xml><?xml version="1.0" encoding="utf-8"?>
-<p:properties xmlns:p="http://schemas.microsoft.com/office/2006/metadata/properties" xmlns:xsi="http://www.w3.org/2001/XMLSchema-instance" xmlns:pc="http://schemas.microsoft.com/office/infopath/2007/PartnerControls">
-  <documentManagement>
-    <lcf76f155ced4ddcb4097134ff3c332f xmlns="08383384-0503-4771-b2ba-6fc3d51bf656">
-      <Terms xmlns="http://schemas.microsoft.com/office/infopath/2007/PartnerControls"/>
-    </lcf76f155ced4ddcb4097134ff3c332f>
-    <TaxCatchAll xmlns="c0acec82-785e-4a01-8b49-a31886450b92" xsi:nil="true"/>
-  </documentManagement>
-</p:properties>
+<b:Sources xmlns:b="http://schemas.openxmlformats.org/officeDocument/2006/bibliography" xmlns="http://schemas.openxmlformats.org/officeDocument/2006/bibliography" SelectedStyle="\APASixthEditionOfficeOnline.xsl" StyleName="APA" Version="6"/>
 </file>
 
 <file path=customXml/item4.xml><?xml version="1.0" encoding="utf-8"?>
@@ -5323,9 +5373,12 @@
 </file>
 
 <file path=customXml/itemProps1.xml><?xml version="1.0" encoding="utf-8"?>
-<ds:datastoreItem xmlns:ds="http://schemas.openxmlformats.org/officeDocument/2006/customXml" ds:itemID="{C077093E-3BC1-48A6-8480-2DA9C69EAEE0}">
+<ds:datastoreItem xmlns:ds="http://schemas.openxmlformats.org/officeDocument/2006/customXml" ds:itemID="{B4284606-6258-4C09-90D8-5C84A71D11A6}">
   <ds:schemaRefs>
-    <ds:schemaRef ds:uri="http://schemas.openxmlformats.org/officeDocument/2006/bibliography"/>
+    <ds:schemaRef ds:uri="http://schemas.microsoft.com/office/2006/metadata/properties"/>
+    <ds:schemaRef ds:uri="http://schemas.microsoft.com/office/infopath/2007/PartnerControls"/>
+    <ds:schemaRef ds:uri="08383384-0503-4771-b2ba-6fc3d51bf656"/>
+    <ds:schemaRef ds:uri="c0acec82-785e-4a01-8b49-a31886450b92"/>
   </ds:schemaRefs>
 </ds:datastoreItem>
 </file>
@@ -5339,12 +5392,9 @@
 </file>
 
 <file path=customXml/itemProps3.xml><?xml version="1.0" encoding="utf-8"?>
-<ds:datastoreItem xmlns:ds="http://schemas.openxmlformats.org/officeDocument/2006/customXml" ds:itemID="{B4284606-6258-4C09-90D8-5C84A71D11A6}">
+<ds:datastoreItem xmlns:ds="http://schemas.openxmlformats.org/officeDocument/2006/customXml" ds:itemID="{C077093E-3BC1-48A6-8480-2DA9C69EAEE0}">
   <ds:schemaRefs>
-    <ds:schemaRef ds:uri="http://schemas.microsoft.com/office/2006/metadata/properties"/>
-    <ds:schemaRef ds:uri="http://schemas.microsoft.com/office/infopath/2007/PartnerControls"/>
-    <ds:schemaRef ds:uri="08383384-0503-4771-b2ba-6fc3d51bf656"/>
-    <ds:schemaRef ds:uri="c0acec82-785e-4a01-8b49-a31886450b92"/>
+    <ds:schemaRef ds:uri="http://schemas.openxmlformats.org/officeDocument/2006/bibliography"/>
   </ds:schemaRefs>
 </ds:datastoreItem>
 </file>

</xml_diff>